<commit_message>
Requirements Doc updated * erd added
</commit_message>
<xml_diff>
--- a/Documentation/Requirements Engineering/Automation of Js Requirements Documentation.docx
+++ b/Documentation/Requirements Engineering/Automation of Js Requirements Documentation.docx
@@ -94,7 +94,7 @@
         <w:rPr>
           <w:rFonts w:ascii="Times New Roman" w:hAnsi="Times New Roman" w:cs="Times New Roman"/>
         </w:rPr>
-        <w:t xml:space="preserve">………………………………………………………….……………. </w:t>
+        <w:t>………………………………………………………….……………</w:t>
       </w:r>
       <w:r>
         <w:rPr>
@@ -102,6 +102,12 @@
         </w:rPr>
         <w:t>I</w:t>
       </w:r>
+      <w:r>
+        <w:rPr>
+          <w:rFonts w:ascii="Times New Roman" w:hAnsi="Times New Roman" w:cs="Times New Roman"/>
+        </w:rPr>
+        <w:t>I</w:t>
+      </w:r>
     </w:p>
     <w:p>
       <w:pPr>
@@ -134,7 +140,13 @@
         <w:rPr>
           <w:rFonts w:ascii="Times New Roman" w:hAnsi="Times New Roman" w:cs="Times New Roman"/>
         </w:rPr>
-        <w:t xml:space="preserve"> II</w:t>
+        <w:t>II</w:t>
+      </w:r>
+      <w:r>
+        <w:rPr>
+          <w:rFonts w:ascii="Times New Roman" w:hAnsi="Times New Roman" w:cs="Times New Roman"/>
+        </w:rPr>
+        <w:t>I</w:t>
       </w:r>
     </w:p>
     <w:p>
@@ -174,7 +186,13 @@
         <w:rPr>
           <w:rFonts w:ascii="Times New Roman" w:hAnsi="Times New Roman" w:cs="Times New Roman"/>
         </w:rPr>
-        <w:t xml:space="preserve"> III</w:t>
+        <w:t>I</w:t>
+      </w:r>
+      <w:r>
+        <w:rPr>
+          <w:rFonts w:ascii="Times New Roman" w:hAnsi="Times New Roman" w:cs="Times New Roman"/>
+        </w:rPr>
+        <w:t>V</w:t>
       </w:r>
     </w:p>
     <w:p>
@@ -222,7 +240,7 @@
         <w:rPr>
           <w:rFonts w:ascii="Times New Roman" w:hAnsi="Times New Roman" w:cs="Times New Roman"/>
         </w:rPr>
-        <w:t xml:space="preserve"> IV</w:t>
+        <w:t>V</w:t>
       </w:r>
     </w:p>
     <w:p>
@@ -242,7 +260,123 @@
         <w:rPr>
           <w:rFonts w:ascii="Times New Roman" w:hAnsi="Times New Roman" w:cs="Times New Roman"/>
         </w:rPr>
-        <w:t>………………………………………………………………………………...</w:t>
+        <w:t>………………………………………………………………………………...V</w:t>
+      </w:r>
+      <w:r>
+        <w:rPr>
+          <w:rFonts w:ascii="Times New Roman" w:hAnsi="Times New Roman" w:cs="Times New Roman"/>
+        </w:rPr>
+        <w:t>I</w:t>
+      </w:r>
+    </w:p>
+    <w:p>
+      <w:pPr>
+        <w:spacing w:line="360" w:lineRule="auto"/>
+        <w:rPr>
+          <w:rFonts w:ascii="Times New Roman" w:hAnsi="Times New Roman" w:cs="Times New Roman"/>
+        </w:rPr>
+      </w:pPr>
+      <w:r>
+        <w:rPr>
+          <w:rFonts w:ascii="Times New Roman" w:hAnsi="Times New Roman" w:cs="Times New Roman"/>
+        </w:rPr>
+        <w:t xml:space="preserve">Class Documentation </w:t>
+      </w:r>
+      <w:r>
+        <w:rPr>
+          <w:rFonts w:ascii="Times New Roman" w:hAnsi="Times New Roman" w:cs="Times New Roman"/>
+        </w:rPr>
+        <w:t>………………….………………………………………….…………</w:t>
+      </w:r>
+      <w:r>
+        <w:rPr>
+          <w:rFonts w:ascii="Times New Roman" w:hAnsi="Times New Roman" w:cs="Times New Roman"/>
+        </w:rPr>
+        <w:t>…</w:t>
+      </w:r>
+      <w:r>
+        <w:rPr>
+          <w:rFonts w:ascii="Times New Roman" w:hAnsi="Times New Roman" w:cs="Times New Roman"/>
+        </w:rPr>
+        <w:t>VI</w:t>
+      </w:r>
+      <w:r>
+        <w:rPr>
+          <w:rFonts w:ascii="Times New Roman" w:hAnsi="Times New Roman" w:cs="Times New Roman"/>
+        </w:rPr>
+        <w:t>I</w:t>
+      </w:r>
+    </w:p>
+    <w:p>
+      <w:pPr>
+        <w:spacing w:line="360" w:lineRule="auto"/>
+        <w:rPr>
+          <w:rFonts w:ascii="Times New Roman" w:hAnsi="Times New Roman" w:cs="Times New Roman"/>
+        </w:rPr>
+      </w:pPr>
+      <w:r>
+        <w:rPr>
+          <w:rFonts w:ascii="Times New Roman" w:hAnsi="Times New Roman" w:cs="Times New Roman"/>
+        </w:rPr>
+        <w:t xml:space="preserve">ER Diagram </w:t>
+      </w:r>
+      <w:r>
+        <w:rPr>
+          <w:rFonts w:ascii="Times New Roman" w:hAnsi="Times New Roman" w:cs="Times New Roman"/>
+        </w:rPr>
+        <w:t>……….……………………………………………………………….………</w:t>
+      </w:r>
+      <w:proofErr w:type="gramStart"/>
+      <w:r>
+        <w:rPr>
+          <w:rFonts w:ascii="Times New Roman" w:hAnsi="Times New Roman" w:cs="Times New Roman"/>
+        </w:rPr>
+        <w:t>….</w:t>
+      </w:r>
+      <w:r>
+        <w:rPr>
+          <w:rFonts w:ascii="Times New Roman" w:hAnsi="Times New Roman" w:cs="Times New Roman"/>
+        </w:rPr>
+        <w:t>.</w:t>
+      </w:r>
+      <w:proofErr w:type="gramEnd"/>
+      <w:r>
+        <w:rPr>
+          <w:rFonts w:ascii="Times New Roman" w:hAnsi="Times New Roman" w:cs="Times New Roman"/>
+        </w:rPr>
+        <w:t>VI</w:t>
+      </w:r>
+      <w:r>
+        <w:rPr>
+          <w:rFonts w:ascii="Times New Roman" w:hAnsi="Times New Roman" w:cs="Times New Roman"/>
+        </w:rPr>
+        <w:t>I</w:t>
+      </w:r>
+      <w:r>
+        <w:rPr>
+          <w:rFonts w:ascii="Times New Roman" w:hAnsi="Times New Roman" w:cs="Times New Roman"/>
+        </w:rPr>
+        <w:t>I</w:t>
+      </w:r>
+    </w:p>
+    <w:p>
+      <w:pPr>
+        <w:spacing w:line="360" w:lineRule="auto"/>
+        <w:rPr>
+          <w:rFonts w:ascii="Times New Roman" w:hAnsi="Times New Roman" w:cs="Times New Roman"/>
+        </w:rPr>
+      </w:pPr>
+      <w:r>
+        <w:rPr>
+          <w:rFonts w:ascii="Times New Roman" w:hAnsi="Times New Roman" w:cs="Times New Roman"/>
+        </w:rPr>
+        <w:t xml:space="preserve">Decision Table </w:t>
+      </w:r>
+      <w:r>
+        <w:rPr>
+          <w:rFonts w:ascii="Times New Roman" w:hAnsi="Times New Roman" w:cs="Times New Roman"/>
+        </w:rPr>
+        <w:t>………………………………………………………….………….………….</w:t>
       </w:r>
       <w:r>
         <w:rPr>
@@ -254,103 +388,7 @@
         <w:rPr>
           <w:rFonts w:ascii="Times New Roman" w:hAnsi="Times New Roman" w:cs="Times New Roman"/>
         </w:rPr>
-        <w:t>V</w:t>
-      </w:r>
-    </w:p>
-    <w:p>
-      <w:pPr>
-        <w:spacing w:line="360" w:lineRule="auto"/>
-        <w:rPr>
-          <w:rFonts w:ascii="Times New Roman" w:hAnsi="Times New Roman" w:cs="Times New Roman"/>
-        </w:rPr>
-      </w:pPr>
-      <w:r>
-        <w:rPr>
-          <w:rFonts w:ascii="Times New Roman" w:hAnsi="Times New Roman" w:cs="Times New Roman"/>
-        </w:rPr>
-        <w:t xml:space="preserve">Class Documentation </w:t>
-      </w:r>
-      <w:r>
-        <w:rPr>
-          <w:rFonts w:ascii="Times New Roman" w:hAnsi="Times New Roman" w:cs="Times New Roman"/>
-        </w:rPr>
-        <w:t>………………….………………………………………….……………</w:t>
-      </w:r>
-      <w:r>
-        <w:rPr>
-          <w:rFonts w:ascii="Times New Roman" w:hAnsi="Times New Roman" w:cs="Times New Roman"/>
-        </w:rPr>
-        <w:t xml:space="preserve"> </w:t>
-      </w:r>
-      <w:r>
-        <w:rPr>
-          <w:rFonts w:ascii="Times New Roman" w:hAnsi="Times New Roman" w:cs="Times New Roman"/>
-        </w:rPr>
-        <w:t>VI</w:t>
-      </w:r>
-    </w:p>
-    <w:p>
-      <w:pPr>
-        <w:spacing w:line="360" w:lineRule="auto"/>
-        <w:rPr>
-          <w:rFonts w:ascii="Times New Roman" w:hAnsi="Times New Roman" w:cs="Times New Roman"/>
-        </w:rPr>
-      </w:pPr>
-      <w:r>
-        <w:rPr>
-          <w:rFonts w:ascii="Times New Roman" w:hAnsi="Times New Roman" w:cs="Times New Roman"/>
-        </w:rPr>
-        <w:t xml:space="preserve">ER Diagram </w:t>
-      </w:r>
-      <w:r>
-        <w:rPr>
-          <w:rFonts w:ascii="Times New Roman" w:hAnsi="Times New Roman" w:cs="Times New Roman"/>
-        </w:rPr>
-        <w:t>……….……………………………………………………………….………….</w:t>
-      </w:r>
-      <w:r>
-        <w:rPr>
-          <w:rFonts w:ascii="Times New Roman" w:hAnsi="Times New Roman" w:cs="Times New Roman"/>
-        </w:rPr>
-        <w:t xml:space="preserve"> </w:t>
-      </w:r>
-      <w:r>
-        <w:rPr>
-          <w:rFonts w:ascii="Times New Roman" w:hAnsi="Times New Roman" w:cs="Times New Roman"/>
-        </w:rPr>
-        <w:t>VII</w:t>
-      </w:r>
-    </w:p>
-    <w:p>
-      <w:pPr>
-        <w:spacing w:line="360" w:lineRule="auto"/>
-        <w:rPr>
-          <w:rFonts w:ascii="Times New Roman" w:hAnsi="Times New Roman" w:cs="Times New Roman"/>
-        </w:rPr>
-      </w:pPr>
-      <w:r>
-        <w:rPr>
-          <w:rFonts w:ascii="Times New Roman" w:hAnsi="Times New Roman" w:cs="Times New Roman"/>
-        </w:rPr>
-        <w:t xml:space="preserve">Decision Table </w:t>
-      </w:r>
-      <w:r>
-        <w:rPr>
-          <w:rFonts w:ascii="Times New Roman" w:hAnsi="Times New Roman" w:cs="Times New Roman"/>
-        </w:rPr>
-        <w:t>………………………………………………………….………….………….</w:t>
-      </w:r>
-      <w:r>
-        <w:rPr>
-          <w:rFonts w:ascii="Times New Roman" w:hAnsi="Times New Roman" w:cs="Times New Roman"/>
-        </w:rPr>
-        <w:t xml:space="preserve"> </w:t>
-      </w:r>
-      <w:r>
-        <w:rPr>
-          <w:rFonts w:ascii="Times New Roman" w:hAnsi="Times New Roman" w:cs="Times New Roman"/>
-        </w:rPr>
-        <w:t>VIII</w:t>
+        <w:t>IX</w:t>
       </w:r>
     </w:p>
     <w:p>
@@ -847,170 +885,203 @@
     <w:p>
       <w:pPr>
         <w:spacing w:line="360" w:lineRule="auto"/>
-        <w:rPr>
-          <w:rFonts w:ascii="Times New Roman" w:hAnsi="Times New Roman" w:cs="Times New Roman"/>
-        </w:rPr>
-      </w:pPr>
-    </w:p>
-    <w:p>
-      <w:pPr>
-        <w:spacing w:line="360" w:lineRule="auto"/>
-        <w:rPr>
-          <w:rFonts w:ascii="Times New Roman" w:hAnsi="Times New Roman" w:cs="Times New Roman"/>
-        </w:rPr>
-      </w:pPr>
-    </w:p>
-    <w:p>
-      <w:pPr>
-        <w:spacing w:line="360" w:lineRule="auto"/>
-        <w:rPr>
-          <w:rFonts w:ascii="Times New Roman" w:hAnsi="Times New Roman" w:cs="Times New Roman"/>
-        </w:rPr>
-      </w:pPr>
-    </w:p>
-    <w:p>
-      <w:pPr>
-        <w:spacing w:line="360" w:lineRule="auto"/>
-        <w:rPr>
-          <w:rFonts w:ascii="Times New Roman" w:hAnsi="Times New Roman" w:cs="Times New Roman"/>
-        </w:rPr>
-      </w:pPr>
-    </w:p>
-    <w:p>
-      <w:pPr>
-        <w:spacing w:line="360" w:lineRule="auto"/>
-        <w:rPr>
-          <w:rFonts w:ascii="Times New Roman" w:hAnsi="Times New Roman" w:cs="Times New Roman"/>
-        </w:rPr>
-      </w:pPr>
-    </w:p>
-    <w:p>
-      <w:pPr>
-        <w:spacing w:line="360" w:lineRule="auto"/>
-        <w:rPr>
-          <w:rFonts w:ascii="Times New Roman" w:hAnsi="Times New Roman" w:cs="Times New Roman"/>
-        </w:rPr>
-      </w:pPr>
-    </w:p>
-    <w:p>
-      <w:pPr>
-        <w:spacing w:line="360" w:lineRule="auto"/>
-        <w:rPr>
-          <w:rFonts w:ascii="Times New Roman" w:hAnsi="Times New Roman" w:cs="Times New Roman"/>
-        </w:rPr>
-      </w:pPr>
-    </w:p>
-    <w:p>
-      <w:pPr>
-        <w:spacing w:line="360" w:lineRule="auto"/>
-        <w:rPr>
-          <w:rFonts w:ascii="Times New Roman" w:hAnsi="Times New Roman" w:cs="Times New Roman"/>
-        </w:rPr>
-      </w:pPr>
-    </w:p>
-    <w:p>
-      <w:pPr>
-        <w:spacing w:line="360" w:lineRule="auto"/>
-        <w:rPr>
-          <w:rFonts w:ascii="Times New Roman" w:hAnsi="Times New Roman" w:cs="Times New Roman"/>
-        </w:rPr>
-      </w:pPr>
-    </w:p>
-    <w:p>
-      <w:pPr>
-        <w:spacing w:line="360" w:lineRule="auto"/>
-        <w:rPr>
-          <w:rFonts w:ascii="Times New Roman" w:hAnsi="Times New Roman" w:cs="Times New Roman"/>
-        </w:rPr>
-      </w:pPr>
-    </w:p>
-    <w:p>
-      <w:pPr>
-        <w:spacing w:line="360" w:lineRule="auto"/>
-        <w:rPr>
-          <w:rFonts w:ascii="Times New Roman" w:hAnsi="Times New Roman" w:cs="Times New Roman"/>
-        </w:rPr>
-      </w:pPr>
-    </w:p>
-    <w:p>
-      <w:pPr>
-        <w:spacing w:line="360" w:lineRule="auto"/>
-        <w:rPr>
-          <w:rFonts w:ascii="Times New Roman" w:hAnsi="Times New Roman" w:cs="Times New Roman"/>
-        </w:rPr>
-      </w:pPr>
-    </w:p>
-    <w:p>
-      <w:pPr>
-        <w:spacing w:line="360" w:lineRule="auto"/>
-        <w:rPr>
-          <w:rFonts w:ascii="Times New Roman" w:hAnsi="Times New Roman" w:cs="Times New Roman"/>
-        </w:rPr>
-      </w:pPr>
-    </w:p>
-    <w:p>
-      <w:pPr>
-        <w:spacing w:line="360" w:lineRule="auto"/>
-        <w:rPr>
-          <w:rFonts w:ascii="Times New Roman" w:hAnsi="Times New Roman" w:cs="Times New Roman"/>
-        </w:rPr>
-      </w:pPr>
-    </w:p>
-    <w:p>
-      <w:pPr>
-        <w:spacing w:line="360" w:lineRule="auto"/>
-        <w:rPr>
-          <w:rFonts w:ascii="Times New Roman" w:hAnsi="Times New Roman" w:cs="Times New Roman"/>
-        </w:rPr>
-      </w:pPr>
-    </w:p>
-    <w:p>
-      <w:pPr>
-        <w:spacing w:line="360" w:lineRule="auto"/>
-        <w:rPr>
-          <w:rFonts w:ascii="Times New Roman" w:hAnsi="Times New Roman" w:cs="Times New Roman"/>
-        </w:rPr>
-      </w:pPr>
-    </w:p>
-    <w:p>
-      <w:pPr>
-        <w:spacing w:line="360" w:lineRule="auto"/>
-        <w:rPr>
-          <w:rFonts w:ascii="Times New Roman" w:hAnsi="Times New Roman" w:cs="Times New Roman"/>
-        </w:rPr>
-      </w:pPr>
-    </w:p>
-    <w:p>
-      <w:pPr>
-        <w:spacing w:line="360" w:lineRule="auto"/>
-        <w:rPr>
-          <w:rFonts w:ascii="Times New Roman" w:hAnsi="Times New Roman" w:cs="Times New Roman"/>
-        </w:rPr>
-      </w:pPr>
-    </w:p>
-    <w:p>
-      <w:pPr>
-        <w:spacing w:line="360" w:lineRule="auto"/>
-        <w:rPr>
-          <w:rFonts w:ascii="Times New Roman" w:hAnsi="Times New Roman" w:cs="Times New Roman"/>
-        </w:rPr>
-      </w:pPr>
-    </w:p>
-    <w:p>
-      <w:pPr>
-        <w:spacing w:line="360" w:lineRule="auto"/>
-        <w:rPr>
-          <w:rFonts w:ascii="Times New Roman" w:hAnsi="Times New Roman" w:cs="Times New Roman"/>
-        </w:rPr>
-      </w:pPr>
-    </w:p>
-    <w:p>
-      <w:pPr>
-        <w:spacing w:line="360" w:lineRule="auto"/>
-        <w:rPr>
-          <w:rFonts w:ascii="Times New Roman" w:hAnsi="Times New Roman" w:cs="Times New Roman"/>
-        </w:rPr>
-      </w:pPr>
+        <w:jc w:val="center"/>
+        <w:rPr>
+          <w:rFonts w:ascii="Times New Roman" w:hAnsi="Times New Roman" w:cs="Times New Roman"/>
+        </w:rPr>
+      </w:pPr>
+      <w:r>
+        <w:rPr>
+          <w:rFonts w:ascii="Times New Roman" w:hAnsi="Times New Roman" w:cs="Times New Roman"/>
+          <w:noProof/>
+        </w:rPr>
+        <w:drawing>
+          <wp:inline distT="0" distB="0" distL="0" distR="0" wp14:anchorId="253B5C92" wp14:editId="1E1D7E80">
+            <wp:extent cx="2484120" cy="2041843"/>
+            <wp:effectExtent l="19050" t="19050" r="11430" b="15875"/>
+            <wp:docPr id="1329034444" name="Picture 1"/>
+            <wp:cNvGraphicFramePr>
+              <a:graphicFrameLocks xmlns:a="http://schemas.openxmlformats.org/drawingml/2006/main" noChangeAspect="1"/>
+            </wp:cNvGraphicFramePr>
+            <a:graphic xmlns:a="http://schemas.openxmlformats.org/drawingml/2006/main">
+              <a:graphicData uri="http://schemas.openxmlformats.org/drawingml/2006/picture">
+                <pic:pic xmlns:pic="http://schemas.openxmlformats.org/drawingml/2006/picture">
+                  <pic:nvPicPr>
+                    <pic:cNvPr id="1329034444" name="Picture 1329034444"/>
+                    <pic:cNvPicPr/>
+                  </pic:nvPicPr>
+                  <pic:blipFill rotWithShape="1">
+                    <a:blip r:embed="rId6" cstate="print">
+                      <a:extLst>
+                        <a:ext uri="{28A0092B-C50C-407E-A947-70E740481C1C}">
+                          <a14:useLocalDpi xmlns:a14="http://schemas.microsoft.com/office/drawing/2010/main" val="0"/>
+                        </a:ext>
+                      </a:extLst>
+                    </a:blip>
+                    <a:srcRect l="27948" t="12991" r="28847" b="23875"/>
+                    <a:stretch>
+                      <a:fillRect/>
+                    </a:stretch>
+                  </pic:blipFill>
+                  <pic:spPr bwMode="auto">
+                    <a:xfrm>
+                      <a:off x="0" y="0"/>
+                      <a:ext cx="2494743" cy="2050574"/>
+                    </a:xfrm>
+                    <a:prstGeom prst="rect">
+                      <a:avLst/>
+                    </a:prstGeom>
+                    <a:ln>
+                      <a:solidFill>
+                        <a:schemeClr val="tx1"/>
+                      </a:solidFill>
+                    </a:ln>
+                    <a:extLst>
+                      <a:ext uri="{53640926-AAD7-44D8-BBD7-CCE9431645EC}">
+                        <a14:shadowObscured xmlns:a14="http://schemas.microsoft.com/office/drawing/2010/main"/>
+                      </a:ext>
+                    </a:extLst>
+                  </pic:spPr>
+                </pic:pic>
+              </a:graphicData>
+            </a:graphic>
+          </wp:inline>
+        </w:drawing>
+      </w:r>
+    </w:p>
+    <w:p>
+      <w:pPr>
+        <w:spacing w:line="360" w:lineRule="auto"/>
+        <w:jc w:val="center"/>
+        <w:rPr>
+          <w:rFonts w:ascii="Times New Roman" w:hAnsi="Times New Roman" w:cs="Times New Roman"/>
+        </w:rPr>
+      </w:pPr>
+      <w:r>
+        <w:rPr>
+          <w:rFonts w:ascii="Times New Roman" w:hAnsi="Times New Roman" w:cs="Times New Roman"/>
+          <w:noProof/>
+        </w:rPr>
+        <w:drawing>
+          <wp:inline distT="0" distB="0" distL="0" distR="0" wp14:anchorId="61CE7601" wp14:editId="781D7BA6">
+            <wp:extent cx="4361700" cy="2171700"/>
+            <wp:effectExtent l="19050" t="19050" r="20320" b="19050"/>
+            <wp:docPr id="1405354983" name="Picture 3"/>
+            <wp:cNvGraphicFramePr>
+              <a:graphicFrameLocks xmlns:a="http://schemas.openxmlformats.org/drawingml/2006/main" noChangeAspect="1"/>
+            </wp:cNvGraphicFramePr>
+            <a:graphic xmlns:a="http://schemas.openxmlformats.org/drawingml/2006/main">
+              <a:graphicData uri="http://schemas.openxmlformats.org/drawingml/2006/picture">
+                <pic:pic xmlns:pic="http://schemas.openxmlformats.org/drawingml/2006/picture">
+                  <pic:nvPicPr>
+                    <pic:cNvPr id="1405354983" name="Picture 1405354983"/>
+                    <pic:cNvPicPr/>
+                  </pic:nvPicPr>
+                  <pic:blipFill rotWithShape="1">
+                    <a:blip r:embed="rId7" cstate="print">
+                      <a:extLst>
+                        <a:ext uri="{28A0092B-C50C-407E-A947-70E740481C1C}">
+                          <a14:useLocalDpi xmlns:a14="http://schemas.microsoft.com/office/drawing/2010/main" val="0"/>
+                        </a:ext>
+                      </a:extLst>
+                    </a:blip>
+                    <a:srcRect l="1539" t="12080" r="6795" b="6781"/>
+                    <a:stretch>
+                      <a:fillRect/>
+                    </a:stretch>
+                  </pic:blipFill>
+                  <pic:spPr bwMode="auto">
+                    <a:xfrm>
+                      <a:off x="0" y="0"/>
+                      <a:ext cx="4374695" cy="2178170"/>
+                    </a:xfrm>
+                    <a:prstGeom prst="rect">
+                      <a:avLst/>
+                    </a:prstGeom>
+                    <a:ln>
+                      <a:solidFill>
+                        <a:schemeClr val="tx1"/>
+                      </a:solidFill>
+                    </a:ln>
+                    <a:extLst>
+                      <a:ext uri="{53640926-AAD7-44D8-BBD7-CCE9431645EC}">
+                        <a14:shadowObscured xmlns:a14="http://schemas.microsoft.com/office/drawing/2010/main"/>
+                      </a:ext>
+                    </a:extLst>
+                  </pic:spPr>
+                </pic:pic>
+              </a:graphicData>
+            </a:graphic>
+          </wp:inline>
+        </w:drawing>
+      </w:r>
+    </w:p>
+    <w:p>
+      <w:pPr>
+        <w:spacing w:line="360" w:lineRule="auto"/>
+        <w:jc w:val="center"/>
+        <w:rPr>
+          <w:rFonts w:ascii="Times New Roman" w:hAnsi="Times New Roman" w:cs="Times New Roman"/>
+        </w:rPr>
+      </w:pPr>
+      <w:r>
+        <w:rPr>
+          <w:rFonts w:ascii="Times New Roman" w:hAnsi="Times New Roman" w:cs="Times New Roman"/>
+          <w:noProof/>
+        </w:rPr>
+        <w:drawing>
+          <wp:inline distT="0" distB="0" distL="0" distR="0" wp14:anchorId="11305267" wp14:editId="5F165DE8">
+            <wp:extent cx="3893820" cy="2750924"/>
+            <wp:effectExtent l="19050" t="19050" r="11430" b="11430"/>
+            <wp:docPr id="1049493634" name="Picture 2"/>
+            <wp:cNvGraphicFramePr>
+              <a:graphicFrameLocks xmlns:a="http://schemas.openxmlformats.org/drawingml/2006/main" noChangeAspect="1"/>
+            </wp:cNvGraphicFramePr>
+            <a:graphic xmlns:a="http://schemas.openxmlformats.org/drawingml/2006/main">
+              <a:graphicData uri="http://schemas.openxmlformats.org/drawingml/2006/picture">
+                <pic:pic xmlns:pic="http://schemas.openxmlformats.org/drawingml/2006/picture">
+                  <pic:nvPicPr>
+                    <pic:cNvPr id="1049493634" name="Picture 1049493634"/>
+                    <pic:cNvPicPr/>
+                  </pic:nvPicPr>
+                  <pic:blipFill rotWithShape="1">
+                    <a:blip r:embed="rId8" cstate="print">
+                      <a:extLst>
+                        <a:ext uri="{28A0092B-C50C-407E-A947-70E740481C1C}">
+                          <a14:useLocalDpi xmlns:a14="http://schemas.microsoft.com/office/drawing/2010/main" val="0"/>
+                        </a:ext>
+                      </a:extLst>
+                    </a:blip>
+                    <a:srcRect r="24872" b="5641"/>
+                    <a:stretch>
+                      <a:fillRect/>
+                    </a:stretch>
+                  </pic:blipFill>
+                  <pic:spPr bwMode="auto">
+                    <a:xfrm>
+                      <a:off x="0" y="0"/>
+                      <a:ext cx="3896911" cy="2753108"/>
+                    </a:xfrm>
+                    <a:prstGeom prst="rect">
+                      <a:avLst/>
+                    </a:prstGeom>
+                    <a:ln>
+                      <a:solidFill>
+                        <a:schemeClr val="tx1"/>
+                      </a:solidFill>
+                    </a:ln>
+                    <a:extLst>
+                      <a:ext uri="{53640926-AAD7-44D8-BBD7-CCE9431645EC}">
+                        <a14:shadowObscured xmlns:a14="http://schemas.microsoft.com/office/drawing/2010/main"/>
+                      </a:ext>
+                    </a:extLst>
+                  </pic:spPr>
+                </pic:pic>
+              </a:graphicData>
+            </a:graphic>
+          </wp:inline>
+        </w:drawing>
+      </w:r>
     </w:p>
     <w:p>
       <w:pPr>
@@ -1615,134 +1686,78 @@
         <w:lastRenderedPageBreak/>
         <w:t>ER Diagram</w:t>
       </w:r>
-    </w:p>
-    <w:p>
-      <w:pPr>
-        <w:spacing w:line="360" w:lineRule="auto"/>
-        <w:rPr>
-          <w:rFonts w:ascii="Times New Roman" w:hAnsi="Times New Roman" w:cs="Times New Roman"/>
-        </w:rPr>
-      </w:pPr>
-    </w:p>
-    <w:p>
-      <w:pPr>
-        <w:spacing w:line="360" w:lineRule="auto"/>
-        <w:rPr>
-          <w:rFonts w:ascii="Times New Roman" w:hAnsi="Times New Roman" w:cs="Times New Roman"/>
-        </w:rPr>
-      </w:pPr>
-    </w:p>
-    <w:p>
-      <w:pPr>
-        <w:spacing w:line="360" w:lineRule="auto"/>
-        <w:rPr>
-          <w:rFonts w:ascii="Times New Roman" w:hAnsi="Times New Roman" w:cs="Times New Roman"/>
-        </w:rPr>
-      </w:pPr>
-    </w:p>
-    <w:p>
-      <w:pPr>
-        <w:spacing w:line="360" w:lineRule="auto"/>
-        <w:rPr>
-          <w:rFonts w:ascii="Times New Roman" w:hAnsi="Times New Roman" w:cs="Times New Roman"/>
-        </w:rPr>
-      </w:pPr>
-    </w:p>
-    <w:p>
-      <w:pPr>
-        <w:spacing w:line="360" w:lineRule="auto"/>
-        <w:rPr>
-          <w:rFonts w:ascii="Times New Roman" w:hAnsi="Times New Roman" w:cs="Times New Roman"/>
-        </w:rPr>
-      </w:pPr>
-    </w:p>
-    <w:p>
-      <w:pPr>
-        <w:spacing w:line="360" w:lineRule="auto"/>
-        <w:rPr>
-          <w:rFonts w:ascii="Times New Roman" w:hAnsi="Times New Roman" w:cs="Times New Roman"/>
-        </w:rPr>
-      </w:pPr>
-    </w:p>
-    <w:p>
-      <w:pPr>
-        <w:spacing w:line="360" w:lineRule="auto"/>
-        <w:rPr>
-          <w:rFonts w:ascii="Times New Roman" w:hAnsi="Times New Roman" w:cs="Times New Roman"/>
-        </w:rPr>
-      </w:pPr>
-    </w:p>
-    <w:p>
-      <w:pPr>
-        <w:spacing w:line="360" w:lineRule="auto"/>
-        <w:rPr>
-          <w:rFonts w:ascii="Times New Roman" w:hAnsi="Times New Roman" w:cs="Times New Roman"/>
-        </w:rPr>
-      </w:pPr>
-    </w:p>
-    <w:p>
-      <w:pPr>
-        <w:spacing w:line="360" w:lineRule="auto"/>
-        <w:rPr>
-          <w:rFonts w:ascii="Times New Roman" w:hAnsi="Times New Roman" w:cs="Times New Roman"/>
-        </w:rPr>
-      </w:pPr>
-    </w:p>
-    <w:p>
-      <w:pPr>
-        <w:spacing w:line="360" w:lineRule="auto"/>
-        <w:rPr>
-          <w:rFonts w:ascii="Times New Roman" w:hAnsi="Times New Roman" w:cs="Times New Roman"/>
-        </w:rPr>
-      </w:pPr>
-    </w:p>
-    <w:p>
-      <w:pPr>
-        <w:spacing w:line="360" w:lineRule="auto"/>
-        <w:rPr>
-          <w:rFonts w:ascii="Times New Roman" w:hAnsi="Times New Roman" w:cs="Times New Roman"/>
-        </w:rPr>
-      </w:pPr>
-    </w:p>
-    <w:p>
-      <w:pPr>
-        <w:spacing w:line="360" w:lineRule="auto"/>
-        <w:rPr>
-          <w:rFonts w:ascii="Times New Roman" w:hAnsi="Times New Roman" w:cs="Times New Roman"/>
-        </w:rPr>
-      </w:pPr>
-    </w:p>
-    <w:p>
-      <w:pPr>
-        <w:spacing w:line="360" w:lineRule="auto"/>
-        <w:rPr>
-          <w:rFonts w:ascii="Times New Roman" w:hAnsi="Times New Roman" w:cs="Times New Roman"/>
-        </w:rPr>
-      </w:pPr>
-    </w:p>
-    <w:p>
-      <w:pPr>
-        <w:spacing w:line="360" w:lineRule="auto"/>
-        <w:rPr>
-          <w:rFonts w:ascii="Times New Roman" w:hAnsi="Times New Roman" w:cs="Times New Roman"/>
-        </w:rPr>
-      </w:pPr>
-    </w:p>
-    <w:p>
-      <w:pPr>
-        <w:spacing w:line="360" w:lineRule="auto"/>
-        <w:rPr>
-          <w:rFonts w:ascii="Times New Roman" w:hAnsi="Times New Roman" w:cs="Times New Roman"/>
-        </w:rPr>
-      </w:pPr>
-    </w:p>
-    <w:p>
-      <w:pPr>
-        <w:spacing w:line="360" w:lineRule="auto"/>
-        <w:rPr>
-          <w:rFonts w:ascii="Times New Roman" w:hAnsi="Times New Roman" w:cs="Times New Roman"/>
-        </w:rPr>
-      </w:pPr>
+      <w:r>
+        <w:rPr>
+          <w:rFonts w:ascii="Times New Roman" w:hAnsi="Times New Roman" w:cs="Times New Roman"/>
+          <w:b/>
+          <w:bCs/>
+        </w:rPr>
+        <w:t>s</w:t>
+      </w:r>
+    </w:p>
+    <w:p>
+      <w:pPr>
+        <w:spacing w:line="360" w:lineRule="auto"/>
+        <w:rPr>
+          <w:rFonts w:ascii="Times New Roman" w:hAnsi="Times New Roman" w:cs="Times New Roman"/>
+        </w:rPr>
+      </w:pPr>
+      <w:r>
+        <w:rPr>
+          <w:rFonts w:ascii="Times New Roman" w:hAnsi="Times New Roman" w:cs="Times New Roman"/>
+          <w:noProof/>
+        </w:rPr>
+        <w:drawing>
+          <wp:inline distT="0" distB="0" distL="0" distR="0" wp14:anchorId="0D8A3305" wp14:editId="72C35367">
+            <wp:extent cx="6286500" cy="5672531"/>
+            <wp:effectExtent l="0" t="0" r="0" b="4445"/>
+            <wp:docPr id="1991016220" name="Picture 1"/>
+            <wp:cNvGraphicFramePr>
+              <a:graphicFrameLocks xmlns:a="http://schemas.openxmlformats.org/drawingml/2006/main" noChangeAspect="1"/>
+            </wp:cNvGraphicFramePr>
+            <a:graphic xmlns:a="http://schemas.openxmlformats.org/drawingml/2006/main">
+              <a:graphicData uri="http://schemas.openxmlformats.org/drawingml/2006/picture">
+                <pic:pic xmlns:pic="http://schemas.openxmlformats.org/drawingml/2006/picture">
+                  <pic:nvPicPr>
+                    <pic:cNvPr id="1991016220" name="Picture 1991016220"/>
+                    <pic:cNvPicPr/>
+                  </pic:nvPicPr>
+                  <pic:blipFill rotWithShape="1">
+                    <a:blip r:embed="rId9">
+                      <a:extLst>
+                        <a:ext uri="{28A0092B-C50C-407E-A947-70E740481C1C}">
+                          <a14:useLocalDpi xmlns:a14="http://schemas.microsoft.com/office/drawing/2010/main" val="0"/>
+                        </a:ext>
+                      </a:extLst>
+                    </a:blip>
+                    <a:srcRect l="21154" t="1824" r="18461" b="1311"/>
+                    <a:stretch>
+                      <a:fillRect/>
+                    </a:stretch>
+                  </pic:blipFill>
+                  <pic:spPr bwMode="auto">
+                    <a:xfrm>
+                      <a:off x="0" y="0"/>
+                      <a:ext cx="6297430" cy="5682393"/>
+                    </a:xfrm>
+                    <a:prstGeom prst="rect">
+                      <a:avLst/>
+                    </a:prstGeom>
+                    <a:ln>
+                      <a:noFill/>
+                    </a:ln>
+                    <a:extLst>
+                      <a:ext uri="{53640926-AAD7-44D8-BBD7-CCE9431645EC}">
+                        <a14:shadowObscured xmlns:a14="http://schemas.microsoft.com/office/drawing/2010/main"/>
+                      </a:ext>
+                    </a:extLst>
+                  </pic:spPr>
+                </pic:pic>
+              </a:graphicData>
+            </a:graphic>
+          </wp:inline>
+        </w:drawing>
+      </w:r>
     </w:p>
     <w:p>
       <w:pPr>
@@ -1834,7 +1849,7 @@
       </w:r>
     </w:p>
     <w:sectPr>
-      <w:headerReference w:type="default" r:id="rId6"/>
+      <w:headerReference w:type="default" r:id="rId10"/>
       <w:pgSz w:w="12240" w:h="15840"/>
       <w:pgMar w:top="1440" w:right="1440" w:bottom="1440" w:left="1440" w:header="720" w:footer="720" w:gutter="0"/>
       <w:cols w:space="720"/>

</xml_diff>

<commit_message>
Reqs Doc Updates * formatting * erd
</commit_message>
<xml_diff>
--- a/Documentation/Requirements Engineering/Automation of Js Requirements Documentation.docx
+++ b/Documentation/Requirements Engineering/Automation of Js Requirements Documentation.docx
@@ -51,8 +51,39 @@
         <w:rPr>
           <w:rFonts w:ascii="Times New Roman" w:hAnsi="Times New Roman" w:cs="Times New Roman"/>
         </w:rPr>
+        <w:t>SWE 3313, Section 03</w:t>
+      </w:r>
+    </w:p>
+    <w:p>
+      <w:pPr>
+        <w:spacing w:line="360" w:lineRule="auto"/>
+        <w:jc w:val="center"/>
+        <w:rPr>
+          <w:rFonts w:ascii="Times New Roman" w:hAnsi="Times New Roman" w:cs="Times New Roman"/>
+          <w:i/>
+          <w:iCs/>
+        </w:rPr>
+      </w:pPr>
+      <w:r>
+        <w:rPr>
+          <w:rFonts w:ascii="Times New Roman" w:hAnsi="Times New Roman" w:cs="Times New Roman"/>
+        </w:rPr>
         <w:t>Team DS</w:t>
       </w:r>
+      <w:r>
+        <w:rPr>
+          <w:rFonts w:ascii="Times New Roman" w:hAnsi="Times New Roman" w:cs="Times New Roman"/>
+        </w:rPr>
+        <w:t xml:space="preserve"> – </w:t>
+      </w:r>
+      <w:r>
+        <w:rPr>
+          <w:rFonts w:ascii="Times New Roman" w:hAnsi="Times New Roman" w:cs="Times New Roman"/>
+          <w:i/>
+          <w:iCs/>
+        </w:rPr>
+        <w:t>contributors list</w:t>
+      </w:r>
     </w:p>
     <w:p>
       <w:pPr>
@@ -390,14 +421,6 @@
         </w:rPr>
         <w:t>IX</w:t>
       </w:r>
-    </w:p>
-    <w:p>
-      <w:pPr>
-        <w:spacing w:line="360" w:lineRule="auto"/>
-        <w:rPr>
-          <w:rFonts w:ascii="Times New Roman" w:hAnsi="Times New Roman" w:cs="Times New Roman"/>
-        </w:rPr>
-      </w:pPr>
     </w:p>
     <w:p>
       <w:pPr>
@@ -498,11 +521,22 @@
     </w:p>
     <w:p>
       <w:pPr>
-        <w:spacing w:line="360" w:lineRule="auto"/>
-        <w:rPr>
-          <w:rFonts w:ascii="Times New Roman" w:hAnsi="Times New Roman" w:cs="Times New Roman"/>
-        </w:rPr>
-      </w:pPr>
+        <w:pStyle w:val="ListParagraph"/>
+        <w:numPr>
+          <w:ilvl w:val="0"/>
+          <w:numId w:val="1"/>
+        </w:numPr>
+        <w:spacing w:line="360" w:lineRule="auto"/>
+        <w:rPr>
+          <w:rFonts w:ascii="Times New Roman" w:hAnsi="Times New Roman" w:cs="Times New Roman"/>
+        </w:rPr>
+      </w:pPr>
+      <w:r>
+        <w:rPr>
+          <w:rFonts w:ascii="Times New Roman" w:hAnsi="Times New Roman" w:cs="Times New Roman"/>
+        </w:rPr>
+        <w:t>Function name – implementation plan</w:t>
+      </w:r>
     </w:p>
     <w:p>
       <w:pPr>
@@ -691,14 +725,30 @@
     </w:p>
     <w:p>
       <w:pPr>
-        <w:spacing w:line="360" w:lineRule="auto"/>
-        <w:rPr>
-          <w:rFonts w:ascii="Times New Roman" w:hAnsi="Times New Roman" w:cs="Times New Roman"/>
-        </w:rPr>
-      </w:pPr>
-    </w:p>
-    <w:p>
-      <w:pPr>
+        <w:pStyle w:val="ListParagraph"/>
+        <w:numPr>
+          <w:ilvl w:val="0"/>
+          <w:numId w:val="2"/>
+        </w:numPr>
+        <w:spacing w:line="360" w:lineRule="auto"/>
+        <w:rPr>
+          <w:rFonts w:ascii="Times New Roman" w:hAnsi="Times New Roman" w:cs="Times New Roman"/>
+        </w:rPr>
+      </w:pPr>
+      <w:r>
+        <w:rPr>
+          <w:rFonts w:ascii="Times New Roman" w:hAnsi="Times New Roman" w:cs="Times New Roman"/>
+        </w:rPr>
+        <w:t>Function name – implementation plan</w:t>
+      </w:r>
+    </w:p>
+    <w:p>
+      <w:pPr>
+        <w:pStyle w:val="ListParagraph"/>
+        <w:numPr>
+          <w:ilvl w:val="0"/>
+          <w:numId w:val="2"/>
+        </w:numPr>
         <w:spacing w:line="360" w:lineRule="auto"/>
         <w:rPr>
           <w:rFonts w:ascii="Times New Roman" w:hAnsi="Times New Roman" w:cs="Times New Roman"/>
@@ -885,7 +935,6 @@
     <w:p>
       <w:pPr>
         <w:spacing w:line="360" w:lineRule="auto"/>
-        <w:jc w:val="center"/>
         <w:rPr>
           <w:rFonts w:ascii="Times New Roman" w:hAnsi="Times New Roman" w:cs="Times New Roman"/>
         </w:rPr>
@@ -896,7 +945,7 @@
           <w:noProof/>
         </w:rPr>
         <w:drawing>
-          <wp:inline distT="0" distB="0" distL="0" distR="0" wp14:anchorId="253B5C92" wp14:editId="1E1D7E80">
+          <wp:inline distT="0" distB="0" distL="0" distR="0" wp14:anchorId="253B5C92" wp14:editId="087A921A">
             <wp:extent cx="2484120" cy="2041843"/>
             <wp:effectExtent l="19050" t="19050" r="11430" b="15875"/>
             <wp:docPr id="1329034444" name="Picture 1"/>
@@ -911,7 +960,7 @@
                     <pic:cNvPicPr/>
                   </pic:nvPicPr>
                   <pic:blipFill rotWithShape="1">
-                    <a:blip r:embed="rId6" cstate="print">
+                    <a:blip r:embed="rId7" cstate="print">
                       <a:extLst>
                         <a:ext uri="{28A0092B-C50C-407E-A947-70E740481C1C}">
                           <a14:useLocalDpi xmlns:a14="http://schemas.microsoft.com/office/drawing/2010/main" val="0"/>
@@ -926,7 +975,7 @@
                   <pic:spPr bwMode="auto">
                     <a:xfrm>
                       <a:off x="0" y="0"/>
-                      <a:ext cx="2494743" cy="2050574"/>
+                      <a:ext cx="2484120" cy="2041843"/>
                     </a:xfrm>
                     <a:prstGeom prst="rect">
                       <a:avLst/>
@@ -952,7 +1001,6 @@
     <w:p>
       <w:pPr>
         <w:spacing w:line="360" w:lineRule="auto"/>
-        <w:jc w:val="center"/>
         <w:rPr>
           <w:rFonts w:ascii="Times New Roman" w:hAnsi="Times New Roman" w:cs="Times New Roman"/>
         </w:rPr>
@@ -978,7 +1026,7 @@
                     <pic:cNvPicPr/>
                   </pic:nvPicPr>
                   <pic:blipFill rotWithShape="1">
-                    <a:blip r:embed="rId7" cstate="print">
+                    <a:blip r:embed="rId8" cstate="print">
                       <a:extLst>
                         <a:ext uri="{28A0092B-C50C-407E-A947-70E740481C1C}">
                           <a14:useLocalDpi xmlns:a14="http://schemas.microsoft.com/office/drawing/2010/main" val="0"/>
@@ -1019,7 +1067,6 @@
     <w:p>
       <w:pPr>
         <w:spacing w:line="360" w:lineRule="auto"/>
-        <w:jc w:val="center"/>
         <w:rPr>
           <w:rFonts w:ascii="Times New Roman" w:hAnsi="Times New Roman" w:cs="Times New Roman"/>
         </w:rPr>
@@ -1045,7 +1092,7 @@
                     <pic:cNvPicPr/>
                   </pic:nvPicPr>
                   <pic:blipFill rotWithShape="1">
-                    <a:blip r:embed="rId8" cstate="print">
+                    <a:blip r:embed="rId9" cstate="print">
                       <a:extLst>
                         <a:ext uri="{28A0092B-C50C-407E-A947-70E740481C1C}">
                           <a14:useLocalDpi xmlns:a14="http://schemas.microsoft.com/office/drawing/2010/main" val="0"/>
@@ -1708,10 +1755,10 @@
           <w:noProof/>
         </w:rPr>
         <w:drawing>
-          <wp:inline distT="0" distB="0" distL="0" distR="0" wp14:anchorId="0D8A3305" wp14:editId="72C35367">
-            <wp:extent cx="6286500" cy="5672531"/>
-            <wp:effectExtent l="0" t="0" r="0" b="4445"/>
-            <wp:docPr id="1991016220" name="Picture 1"/>
+          <wp:inline distT="0" distB="0" distL="0" distR="0" wp14:anchorId="4ABC1F65" wp14:editId="74F497B1">
+            <wp:extent cx="6724152" cy="5772150"/>
+            <wp:effectExtent l="0" t="0" r="635" b="0"/>
+            <wp:docPr id="6972236" name="Picture 3"/>
             <wp:cNvGraphicFramePr>
               <a:graphicFrameLocks xmlns:a="http://schemas.openxmlformats.org/drawingml/2006/main" noChangeAspect="1"/>
             </wp:cNvGraphicFramePr>
@@ -1719,18 +1766,18 @@
               <a:graphicData uri="http://schemas.openxmlformats.org/drawingml/2006/picture">
                 <pic:pic xmlns:pic="http://schemas.openxmlformats.org/drawingml/2006/picture">
                   <pic:nvPicPr>
-                    <pic:cNvPr id="1991016220" name="Picture 1991016220"/>
+                    <pic:cNvPr id="6972236" name="Picture 6972236"/>
                     <pic:cNvPicPr/>
                   </pic:nvPicPr>
                   <pic:blipFill rotWithShape="1">
-                    <a:blip r:embed="rId9">
+                    <a:blip r:embed="rId10">
                       <a:extLst>
                         <a:ext uri="{28A0092B-C50C-407E-A947-70E740481C1C}">
                           <a14:useLocalDpi xmlns:a14="http://schemas.microsoft.com/office/drawing/2010/main" val="0"/>
                         </a:ext>
                       </a:extLst>
                     </a:blip>
-                    <a:srcRect l="21154" t="1824" r="18461" b="1311"/>
+                    <a:srcRect l="9259" t="253" r="7259"/>
                     <a:stretch>
                       <a:fillRect/>
                     </a:stretch>
@@ -1738,7 +1785,7 @@
                   <pic:spPr bwMode="auto">
                     <a:xfrm>
                       <a:off x="0" y="0"/>
-                      <a:ext cx="6297430" cy="5682393"/>
+                      <a:ext cx="6754506" cy="5798206"/>
                     </a:xfrm>
                     <a:prstGeom prst="rect">
                       <a:avLst/>
@@ -1804,14 +1851,6 @@
         <w:spacing w:line="360" w:lineRule="auto"/>
         <w:rPr>
           <w:rFonts w:ascii="Times New Roman" w:hAnsi="Times New Roman" w:cs="Times New Roman"/>
-        </w:rPr>
-      </w:pPr>
-    </w:p>
-    <w:p>
-      <w:pPr>
-        <w:spacing w:line="360" w:lineRule="auto"/>
-        <w:rPr>
-          <w:rFonts w:ascii="Times New Roman" w:hAnsi="Times New Roman" w:cs="Times New Roman"/>
           <w:b/>
           <w:bCs/>
           <w:rPrChange w:id="0" w:author="Claude Davis" w:date="2026-03-04T13:10:00Z" w16du:dateUtc="2026-03-04T18:10:00Z">
@@ -1849,7 +1888,7 @@
       </w:r>
     </w:p>
     <w:sectPr>
-      <w:headerReference w:type="default" r:id="rId10"/>
+      <w:headerReference w:type="default" r:id="rId11"/>
       <w:pgSz w:w="12240" w:h="15840"/>
       <w:pgMar w:top="1440" w:right="1440" w:bottom="1440" w:left="1440" w:header="720" w:footer="720" w:gutter="0"/>
       <w:cols w:space="720"/>
@@ -1981,6 +2020,195 @@
     </w:pPr>
   </w:p>
 </w:hdr>
+</file>
+
+<file path=word/numbering.xml><?xml version="1.0" encoding="utf-8"?>
+<w:numbering xmlns:wpc="http://schemas.microsoft.com/office/word/2010/wordprocessingCanvas" xmlns:cx="http://schemas.microsoft.com/office/drawing/2014/chartex" xmlns:cx1="http://schemas.microsoft.com/office/drawing/2015/9/8/chartex" xmlns:cx2="http://schemas.microsoft.com/office/drawing/2015/10/21/chartex" xmlns:cx3="http://schemas.microsoft.com/office/drawing/2016/5/9/chartex" xmlns:cx4="http://schemas.microsoft.com/office/drawing/2016/5/10/chartex" xmlns:cx5="http://schemas.microsoft.com/office/drawing/2016/5/11/chartex" xmlns:cx6="http://schemas.microsoft.com/office/drawing/2016/5/12/chartex" xmlns:cx7="http://schemas.microsoft.com/office/drawing/2016/5/13/chartex" xmlns:cx8="http://schemas.microsoft.com/office/drawing/2016/5/14/chartex" xmlns:mc="http://schemas.openxmlformats.org/markup-compatibility/2006" xmlns:aink="http://schemas.microsoft.com/office/drawing/2016/ink" xmlns:am3d="http://schemas.microsoft.com/office/drawing/2017/model3d" xmlns:o="urn:schemas-microsoft-com:office:office" xmlns:oel="http://schemas.microsoft.com/office/2019/extlst" xmlns:r="http://schemas.openxmlformats.org/officeDocument/2006/relationships" xmlns:m="http://schemas.openxmlformats.org/officeDocument/2006/math" xmlns:v="urn:schemas-microsoft-com:vml" xmlns:wp14="http://schemas.microsoft.com/office/word/2010/wordprocessingDrawing" xmlns:wp="http://schemas.openxmlformats.org/drawingml/2006/wordprocessingDrawing" xmlns:w10="urn:schemas-microsoft-com:office:word" xmlns:w="http://schemas.openxmlformats.org/wordprocessingml/2006/main" xmlns:w14="http://schemas.microsoft.com/office/word/2010/wordml" xmlns:w15="http://schemas.microsoft.com/office/word/2012/wordml" xmlns:w16cex="http://schemas.microsoft.com/office/word/2018/wordml/cex" xmlns:w16cid="http://schemas.microsoft.com/office/word/2016/wordml/cid" xmlns:w16="http://schemas.microsoft.com/office/word/2018/wordml" xmlns:w16du="http://schemas.microsoft.com/office/word/2023/wordml/word16du" xmlns:w16sdtdh="http://schemas.microsoft.com/office/word/2020/wordml/sdtdatahash" xmlns:w16sdtfl="http://schemas.microsoft.com/office/word/2024/wordml/sdtformatlock" xmlns:w16se="http://schemas.microsoft.com/office/word/2015/wordml/symex" xmlns:wpg="http://schemas.microsoft.com/office/word/2010/wordprocessingGroup" xmlns:wpi="http://schemas.microsoft.com/office/word/2010/wordprocessingInk" xmlns:wne="http://schemas.microsoft.com/office/word/2006/wordml" xmlns:wps="http://schemas.microsoft.com/office/word/2010/wordprocessingShape" mc:Ignorable="w14 w15 w16se w16cid w16 w16cex w16sdtdh w16sdtfl w16du wp14">
+  <w:abstractNum w:abstractNumId="0" w15:restartNumberingAfterBreak="0">
+    <w:nsid w:val="1FF11500"/>
+    <w:multiLevelType w:val="hybridMultilevel"/>
+    <w:tmpl w:val="7758E666"/>
+    <w:lvl w:ilvl="0" w:tplc="0409000F">
+      <w:start w:val="1"/>
+      <w:numFmt w:val="decimal"/>
+      <w:lvlText w:val="%1."/>
+      <w:lvlJc w:val="left"/>
+      <w:pPr>
+        <w:ind w:left="720" w:hanging="360"/>
+      </w:pPr>
+      <w:rPr>
+        <w:rFonts w:hint="default"/>
+      </w:rPr>
+    </w:lvl>
+    <w:lvl w:ilvl="1" w:tplc="04090019" w:tentative="1">
+      <w:start w:val="1"/>
+      <w:numFmt w:val="lowerLetter"/>
+      <w:lvlText w:val="%2."/>
+      <w:lvlJc w:val="left"/>
+      <w:pPr>
+        <w:ind w:left="1440" w:hanging="360"/>
+      </w:pPr>
+    </w:lvl>
+    <w:lvl w:ilvl="2" w:tplc="0409001B" w:tentative="1">
+      <w:start w:val="1"/>
+      <w:numFmt w:val="lowerRoman"/>
+      <w:lvlText w:val="%3."/>
+      <w:lvlJc w:val="right"/>
+      <w:pPr>
+        <w:ind w:left="2160" w:hanging="180"/>
+      </w:pPr>
+    </w:lvl>
+    <w:lvl w:ilvl="3" w:tplc="0409000F" w:tentative="1">
+      <w:start w:val="1"/>
+      <w:numFmt w:val="decimal"/>
+      <w:lvlText w:val="%4."/>
+      <w:lvlJc w:val="left"/>
+      <w:pPr>
+        <w:ind w:left="2880" w:hanging="360"/>
+      </w:pPr>
+    </w:lvl>
+    <w:lvl w:ilvl="4" w:tplc="04090019" w:tentative="1">
+      <w:start w:val="1"/>
+      <w:numFmt w:val="lowerLetter"/>
+      <w:lvlText w:val="%5."/>
+      <w:lvlJc w:val="left"/>
+      <w:pPr>
+        <w:ind w:left="3600" w:hanging="360"/>
+      </w:pPr>
+    </w:lvl>
+    <w:lvl w:ilvl="5" w:tplc="0409001B" w:tentative="1">
+      <w:start w:val="1"/>
+      <w:numFmt w:val="lowerRoman"/>
+      <w:lvlText w:val="%6."/>
+      <w:lvlJc w:val="right"/>
+      <w:pPr>
+        <w:ind w:left="4320" w:hanging="180"/>
+      </w:pPr>
+    </w:lvl>
+    <w:lvl w:ilvl="6" w:tplc="0409000F" w:tentative="1">
+      <w:start w:val="1"/>
+      <w:numFmt w:val="decimal"/>
+      <w:lvlText w:val="%7."/>
+      <w:lvlJc w:val="left"/>
+      <w:pPr>
+        <w:ind w:left="5040" w:hanging="360"/>
+      </w:pPr>
+    </w:lvl>
+    <w:lvl w:ilvl="7" w:tplc="04090019" w:tentative="1">
+      <w:start w:val="1"/>
+      <w:numFmt w:val="lowerLetter"/>
+      <w:lvlText w:val="%8."/>
+      <w:lvlJc w:val="left"/>
+      <w:pPr>
+        <w:ind w:left="5760" w:hanging="360"/>
+      </w:pPr>
+    </w:lvl>
+    <w:lvl w:ilvl="8" w:tplc="0409001B" w:tentative="1">
+      <w:start w:val="1"/>
+      <w:numFmt w:val="lowerRoman"/>
+      <w:lvlText w:val="%9."/>
+      <w:lvlJc w:val="right"/>
+      <w:pPr>
+        <w:ind w:left="6480" w:hanging="180"/>
+      </w:pPr>
+    </w:lvl>
+  </w:abstractNum>
+  <w:abstractNum w:abstractNumId="1" w15:restartNumberingAfterBreak="0">
+    <w:nsid w:val="5A6356F4"/>
+    <w:multiLevelType w:val="hybridMultilevel"/>
+    <w:tmpl w:val="7758E666"/>
+    <w:lvl w:ilvl="0" w:tplc="FFFFFFFF">
+      <w:start w:val="1"/>
+      <w:numFmt w:val="decimal"/>
+      <w:lvlText w:val="%1."/>
+      <w:lvlJc w:val="left"/>
+      <w:pPr>
+        <w:ind w:left="720" w:hanging="360"/>
+      </w:pPr>
+      <w:rPr>
+        <w:rFonts w:hint="default"/>
+      </w:rPr>
+    </w:lvl>
+    <w:lvl w:ilvl="1" w:tplc="FFFFFFFF" w:tentative="1">
+      <w:start w:val="1"/>
+      <w:numFmt w:val="lowerLetter"/>
+      <w:lvlText w:val="%2."/>
+      <w:lvlJc w:val="left"/>
+      <w:pPr>
+        <w:ind w:left="1440" w:hanging="360"/>
+      </w:pPr>
+    </w:lvl>
+    <w:lvl w:ilvl="2" w:tplc="FFFFFFFF" w:tentative="1">
+      <w:start w:val="1"/>
+      <w:numFmt w:val="lowerRoman"/>
+      <w:lvlText w:val="%3."/>
+      <w:lvlJc w:val="right"/>
+      <w:pPr>
+        <w:ind w:left="2160" w:hanging="180"/>
+      </w:pPr>
+    </w:lvl>
+    <w:lvl w:ilvl="3" w:tplc="FFFFFFFF" w:tentative="1">
+      <w:start w:val="1"/>
+      <w:numFmt w:val="decimal"/>
+      <w:lvlText w:val="%4."/>
+      <w:lvlJc w:val="left"/>
+      <w:pPr>
+        <w:ind w:left="2880" w:hanging="360"/>
+      </w:pPr>
+    </w:lvl>
+    <w:lvl w:ilvl="4" w:tplc="FFFFFFFF" w:tentative="1">
+      <w:start w:val="1"/>
+      <w:numFmt w:val="lowerLetter"/>
+      <w:lvlText w:val="%5."/>
+      <w:lvlJc w:val="left"/>
+      <w:pPr>
+        <w:ind w:left="3600" w:hanging="360"/>
+      </w:pPr>
+    </w:lvl>
+    <w:lvl w:ilvl="5" w:tplc="FFFFFFFF" w:tentative="1">
+      <w:start w:val="1"/>
+      <w:numFmt w:val="lowerRoman"/>
+      <w:lvlText w:val="%6."/>
+      <w:lvlJc w:val="right"/>
+      <w:pPr>
+        <w:ind w:left="4320" w:hanging="180"/>
+      </w:pPr>
+    </w:lvl>
+    <w:lvl w:ilvl="6" w:tplc="FFFFFFFF" w:tentative="1">
+      <w:start w:val="1"/>
+      <w:numFmt w:val="decimal"/>
+      <w:lvlText w:val="%7."/>
+      <w:lvlJc w:val="left"/>
+      <w:pPr>
+        <w:ind w:left="5040" w:hanging="360"/>
+      </w:pPr>
+    </w:lvl>
+    <w:lvl w:ilvl="7" w:tplc="FFFFFFFF" w:tentative="1">
+      <w:start w:val="1"/>
+      <w:numFmt w:val="lowerLetter"/>
+      <w:lvlText w:val="%8."/>
+      <w:lvlJc w:val="left"/>
+      <w:pPr>
+        <w:ind w:left="5760" w:hanging="360"/>
+      </w:pPr>
+    </w:lvl>
+    <w:lvl w:ilvl="8" w:tplc="FFFFFFFF" w:tentative="1">
+      <w:start w:val="1"/>
+      <w:numFmt w:val="lowerRoman"/>
+      <w:lvlText w:val="%9."/>
+      <w:lvlJc w:val="right"/>
+      <w:pPr>
+        <w:ind w:left="6480" w:hanging="180"/>
+      </w:pPr>
+    </w:lvl>
+  </w:abstractNum>
+  <w:num w:numId="1" w16cid:durableId="435097565">
+    <w:abstractNumId w:val="0"/>
+  </w:num>
+  <w:num w:numId="2" w16cid:durableId="296642784">
+    <w:abstractNumId w:val="1"/>
+  </w:num>
+</w:numbering>
 </file>
 
 <file path=word/people.xml><?xml version="1.0" encoding="utf-8"?>

</xml_diff>

<commit_message>
Use Case Diagrams updated * previous diagrams replaced by updated diagrams * Requirements Doc updated to include new Use Case diagrams
</commit_message>
<xml_diff>
--- a/Documentation/Requirements Engineering/Automation of Js Requirements Documentation.docx
+++ b/Documentation/Requirements Engineering/Automation of Js Requirements Documentation.docx
@@ -945,10 +945,10 @@
           <w:noProof/>
         </w:rPr>
         <w:drawing>
-          <wp:inline distT="0" distB="0" distL="0" distR="0" wp14:anchorId="253B5C92" wp14:editId="087A921A">
-            <wp:extent cx="2484120" cy="2041843"/>
-            <wp:effectExtent l="19050" t="19050" r="11430" b="15875"/>
-            <wp:docPr id="1329034444" name="Picture 1"/>
+          <wp:inline distT="0" distB="0" distL="0" distR="0" wp14:anchorId="35A44D1D" wp14:editId="0048A4D8">
+            <wp:extent cx="5943600" cy="3343275"/>
+            <wp:effectExtent l="0" t="0" r="0" b="9525"/>
+            <wp:docPr id="1963488872" name="Picture 1"/>
             <wp:cNvGraphicFramePr>
               <a:graphicFrameLocks xmlns:a="http://schemas.openxmlformats.org/drawingml/2006/main" noChangeAspect="1"/>
             </wp:cNvGraphicFramePr>
@@ -956,10 +956,10 @@
               <a:graphicData uri="http://schemas.openxmlformats.org/drawingml/2006/picture">
                 <pic:pic xmlns:pic="http://schemas.openxmlformats.org/drawingml/2006/picture">
                   <pic:nvPicPr>
-                    <pic:cNvPr id="1329034444" name="Picture 1329034444"/>
+                    <pic:cNvPr id="1963488872" name="Picture 1963488872"/>
                     <pic:cNvPicPr/>
                   </pic:nvPicPr>
-                  <pic:blipFill rotWithShape="1">
+                  <pic:blipFill>
                     <a:blip r:embed="rId7" cstate="print">
                       <a:extLst>
                         <a:ext uri="{28A0092B-C50C-407E-A947-70E740481C1C}">
@@ -967,29 +967,18 @@
                         </a:ext>
                       </a:extLst>
                     </a:blip>
-                    <a:srcRect l="27948" t="12991" r="28847" b="23875"/>
                     <a:stretch>
                       <a:fillRect/>
                     </a:stretch>
                   </pic:blipFill>
-                  <pic:spPr bwMode="auto">
+                  <pic:spPr>
                     <a:xfrm>
                       <a:off x="0" y="0"/>
-                      <a:ext cx="2484120" cy="2041843"/>
+                      <a:ext cx="5943600" cy="3343275"/>
                     </a:xfrm>
                     <a:prstGeom prst="rect">
                       <a:avLst/>
                     </a:prstGeom>
-                    <a:ln>
-                      <a:solidFill>
-                        <a:schemeClr val="tx1"/>
-                      </a:solidFill>
-                    </a:ln>
-                    <a:extLst>
-                      <a:ext uri="{53640926-AAD7-44D8-BBD7-CCE9431645EC}">
-                        <a14:shadowObscured xmlns:a14="http://schemas.microsoft.com/office/drawing/2010/main"/>
-                      </a:ext>
-                    </a:extLst>
                   </pic:spPr>
                 </pic:pic>
               </a:graphicData>
@@ -997,24 +986,16 @@
           </wp:inline>
         </w:drawing>
       </w:r>
-    </w:p>
-    <w:p>
-      <w:pPr>
-        <w:spacing w:line="360" w:lineRule="auto"/>
-        <w:rPr>
-          <w:rFonts w:ascii="Times New Roman" w:hAnsi="Times New Roman" w:cs="Times New Roman"/>
-        </w:rPr>
-      </w:pPr>
       <w:r>
         <w:rPr>
           <w:rFonts w:ascii="Times New Roman" w:hAnsi="Times New Roman" w:cs="Times New Roman"/>
           <w:noProof/>
         </w:rPr>
         <w:drawing>
-          <wp:inline distT="0" distB="0" distL="0" distR="0" wp14:anchorId="61CE7601" wp14:editId="781D7BA6">
-            <wp:extent cx="4361700" cy="2171700"/>
-            <wp:effectExtent l="19050" t="19050" r="20320" b="19050"/>
-            <wp:docPr id="1405354983" name="Picture 3"/>
+          <wp:inline distT="0" distB="0" distL="0" distR="0" wp14:anchorId="06729046" wp14:editId="1DE89FD6">
+            <wp:extent cx="5943600" cy="3343275"/>
+            <wp:effectExtent l="0" t="0" r="0" b="9525"/>
+            <wp:docPr id="1112437677" name="Picture 2"/>
             <wp:cNvGraphicFramePr>
               <a:graphicFrameLocks xmlns:a="http://schemas.openxmlformats.org/drawingml/2006/main" noChangeAspect="1"/>
             </wp:cNvGraphicFramePr>
@@ -1022,10 +1003,10 @@
               <a:graphicData uri="http://schemas.openxmlformats.org/drawingml/2006/picture">
                 <pic:pic xmlns:pic="http://schemas.openxmlformats.org/drawingml/2006/picture">
                   <pic:nvPicPr>
-                    <pic:cNvPr id="1405354983" name="Picture 1405354983"/>
+                    <pic:cNvPr id="1112437677" name="Picture 1112437677"/>
                     <pic:cNvPicPr/>
                   </pic:nvPicPr>
-                  <pic:blipFill rotWithShape="1">
+                  <pic:blipFill>
                     <a:blip r:embed="rId8" cstate="print">
                       <a:extLst>
                         <a:ext uri="{28A0092B-C50C-407E-A947-70E740481C1C}">
@@ -1033,29 +1014,18 @@
                         </a:ext>
                       </a:extLst>
                     </a:blip>
-                    <a:srcRect l="1539" t="12080" r="6795" b="6781"/>
                     <a:stretch>
                       <a:fillRect/>
                     </a:stretch>
                   </pic:blipFill>
-                  <pic:spPr bwMode="auto">
+                  <pic:spPr>
                     <a:xfrm>
                       <a:off x="0" y="0"/>
-                      <a:ext cx="4374695" cy="2178170"/>
+                      <a:ext cx="5943600" cy="3343275"/>
                     </a:xfrm>
                     <a:prstGeom prst="rect">
                       <a:avLst/>
                     </a:prstGeom>
-                    <a:ln>
-                      <a:solidFill>
-                        <a:schemeClr val="tx1"/>
-                      </a:solidFill>
-                    </a:ln>
-                    <a:extLst>
-                      <a:ext uri="{53640926-AAD7-44D8-BBD7-CCE9431645EC}">
-                        <a14:shadowObscured xmlns:a14="http://schemas.microsoft.com/office/drawing/2010/main"/>
-                      </a:ext>
-                    </a:extLst>
                   </pic:spPr>
                 </pic:pic>
               </a:graphicData>
@@ -1071,64 +1041,6 @@
           <w:rFonts w:ascii="Times New Roman" w:hAnsi="Times New Roman" w:cs="Times New Roman"/>
         </w:rPr>
       </w:pPr>
-      <w:r>
-        <w:rPr>
-          <w:rFonts w:ascii="Times New Roman" w:hAnsi="Times New Roman" w:cs="Times New Roman"/>
-          <w:noProof/>
-        </w:rPr>
-        <w:drawing>
-          <wp:inline distT="0" distB="0" distL="0" distR="0" wp14:anchorId="11305267" wp14:editId="5F165DE8">
-            <wp:extent cx="3893820" cy="2750924"/>
-            <wp:effectExtent l="19050" t="19050" r="11430" b="11430"/>
-            <wp:docPr id="1049493634" name="Picture 2"/>
-            <wp:cNvGraphicFramePr>
-              <a:graphicFrameLocks xmlns:a="http://schemas.openxmlformats.org/drawingml/2006/main" noChangeAspect="1"/>
-            </wp:cNvGraphicFramePr>
-            <a:graphic xmlns:a="http://schemas.openxmlformats.org/drawingml/2006/main">
-              <a:graphicData uri="http://schemas.openxmlformats.org/drawingml/2006/picture">
-                <pic:pic xmlns:pic="http://schemas.openxmlformats.org/drawingml/2006/picture">
-                  <pic:nvPicPr>
-                    <pic:cNvPr id="1049493634" name="Picture 1049493634"/>
-                    <pic:cNvPicPr/>
-                  </pic:nvPicPr>
-                  <pic:blipFill rotWithShape="1">
-                    <a:blip r:embed="rId9" cstate="print">
-                      <a:extLst>
-                        <a:ext uri="{28A0092B-C50C-407E-A947-70E740481C1C}">
-                          <a14:useLocalDpi xmlns:a14="http://schemas.microsoft.com/office/drawing/2010/main" val="0"/>
-                        </a:ext>
-                      </a:extLst>
-                    </a:blip>
-                    <a:srcRect r="24872" b="5641"/>
-                    <a:stretch>
-                      <a:fillRect/>
-                    </a:stretch>
-                  </pic:blipFill>
-                  <pic:spPr bwMode="auto">
-                    <a:xfrm>
-                      <a:off x="0" y="0"/>
-                      <a:ext cx="3896911" cy="2753108"/>
-                    </a:xfrm>
-                    <a:prstGeom prst="rect">
-                      <a:avLst/>
-                    </a:prstGeom>
-                    <a:ln>
-                      <a:solidFill>
-                        <a:schemeClr val="tx1"/>
-                      </a:solidFill>
-                    </a:ln>
-                    <a:extLst>
-                      <a:ext uri="{53640926-AAD7-44D8-BBD7-CCE9431645EC}">
-                        <a14:shadowObscured xmlns:a14="http://schemas.microsoft.com/office/drawing/2010/main"/>
-                      </a:ext>
-                    </a:extLst>
-                  </pic:spPr>
-                </pic:pic>
-              </a:graphicData>
-            </a:graphic>
-          </wp:inline>
-        </w:drawing>
-      </w:r>
     </w:p>
     <w:p>
       <w:pPr>
@@ -1770,7 +1682,7 @@
                     <pic:cNvPicPr/>
                   </pic:nvPicPr>
                   <pic:blipFill rotWithShape="1">
-                    <a:blip r:embed="rId10">
+                    <a:blip r:embed="rId9">
                       <a:extLst>
                         <a:ext uri="{28A0092B-C50C-407E-A947-70E740481C1C}">
                           <a14:useLocalDpi xmlns:a14="http://schemas.microsoft.com/office/drawing/2010/main" val="0"/>
@@ -1888,7 +1800,7 @@
       </w:r>
     </w:p>
     <w:sectPr>
-      <w:headerReference w:type="default" r:id="rId11"/>
+      <w:headerReference w:type="default" r:id="rId10"/>
       <w:pgSz w:w="12240" w:h="15840"/>
       <w:pgMar w:top="1440" w:right="1440" w:bottom="1440" w:left="1440" w:header="720" w:footer="720" w:gutter="0"/>
       <w:cols w:space="720"/>

</xml_diff>

<commit_message>
Requirements Doc updated * reqs specified * implemntation plan provided
</commit_message>
<xml_diff>
--- a/Documentation/Requirements Engineering/Automation of Js Requirements Documentation.docx
+++ b/Documentation/Requirements Engineering/Automation of Js Requirements Documentation.docx
@@ -459,6 +459,37 @@
         </w:rPr>
         <w:t xml:space="preserve">R.D.1 – </w:t>
       </w:r>
+      <w:r>
+        <w:rPr>
+          <w:rFonts w:ascii="Times New Roman" w:hAnsi="Times New Roman" w:cs="Times New Roman"/>
+        </w:rPr>
+        <w:t>The system shall collect and store data for customer turnaround time.</w:t>
+      </w:r>
+    </w:p>
+    <w:p>
+      <w:pPr>
+        <w:pStyle w:val="ListParagraph"/>
+        <w:numPr>
+          <w:ilvl w:val="1"/>
+          <w:numId w:val="1"/>
+        </w:numPr>
+        <w:spacing w:line="360" w:lineRule="auto"/>
+        <w:rPr>
+          <w:rFonts w:ascii="Times New Roman" w:hAnsi="Times New Roman" w:cs="Times New Roman"/>
+        </w:rPr>
+      </w:pPr>
+      <w:r>
+        <w:rPr>
+          <w:rFonts w:ascii="Times New Roman" w:hAnsi="Times New Roman" w:cs="Times New Roman"/>
+        </w:rPr>
+        <w:t xml:space="preserve">During operational hours, the system will collect data regarding how long </w:t>
+      </w:r>
+      <w:r>
+        <w:rPr>
+          <w:rFonts w:ascii="Times New Roman" w:hAnsi="Times New Roman" w:cs="Times New Roman"/>
+        </w:rPr>
+        <w:t>customers spend within the restaurant (based on time durations of when a table is occupied to when a table is ready to be cleaned). This data will be stored with a MySQL database and organized to allow for easy identification of specific and average turnaround times during certain periods. This data is accessible only to the manager.</w:t>
+      </w:r>
     </w:p>
     <w:p>
       <w:pPr>
@@ -476,13 +507,90 @@
         <w:rPr>
           <w:rFonts w:ascii="Times New Roman" w:hAnsi="Times New Roman" w:cs="Times New Roman"/>
         </w:rPr>
-        <w:t>R.D.</w:t>
-      </w:r>
-      <w:r>
-        <w:rPr>
-          <w:rFonts w:ascii="Times New Roman" w:hAnsi="Times New Roman" w:cs="Times New Roman"/>
-        </w:rPr>
-        <w:t xml:space="preserve">2 – </w:t>
+        <w:t xml:space="preserve">R.D.2 – </w:t>
+      </w:r>
+      <w:r>
+        <w:rPr>
+          <w:rFonts w:ascii="Times New Roman" w:hAnsi="Times New Roman" w:cs="Times New Roman"/>
+        </w:rPr>
+        <w:t>The system shall collect and store data for food preparation time.</w:t>
+      </w:r>
+    </w:p>
+    <w:p>
+      <w:pPr>
+        <w:pStyle w:val="ListParagraph"/>
+        <w:numPr>
+          <w:ilvl w:val="1"/>
+          <w:numId w:val="1"/>
+        </w:numPr>
+        <w:spacing w:line="360" w:lineRule="auto"/>
+        <w:rPr>
+          <w:rFonts w:ascii="Times New Roman" w:hAnsi="Times New Roman" w:cs="Times New Roman"/>
+        </w:rPr>
+      </w:pPr>
+      <w:r>
+        <w:rPr>
+          <w:rFonts w:ascii="Times New Roman" w:hAnsi="Times New Roman" w:cs="Times New Roman"/>
+        </w:rPr>
+        <w:t xml:space="preserve">During operational </w:t>
+      </w:r>
+      <w:r>
+        <w:rPr>
+          <w:rFonts w:ascii="Times New Roman" w:hAnsi="Times New Roman" w:cs="Times New Roman"/>
+        </w:rPr>
+        <w:t>hours</w:t>
+      </w:r>
+      <w:r>
+        <w:rPr>
+          <w:rFonts w:ascii="Times New Roman" w:hAnsi="Times New Roman" w:cs="Times New Roman"/>
+        </w:rPr>
+        <w:t xml:space="preserve">, the system will record </w:t>
+      </w:r>
+      <w:proofErr w:type="gramStart"/>
+      <w:r>
+        <w:rPr>
+          <w:rFonts w:ascii="Times New Roman" w:hAnsi="Times New Roman" w:cs="Times New Roman"/>
+        </w:rPr>
+        <w:t>the time</w:t>
+      </w:r>
+      <w:proofErr w:type="gramEnd"/>
+      <w:r>
+        <w:rPr>
+          <w:rFonts w:ascii="Times New Roman" w:hAnsi="Times New Roman" w:cs="Times New Roman"/>
+        </w:rPr>
+        <w:t xml:space="preserve"> duration </w:t>
+      </w:r>
+      <w:proofErr w:type="gramStart"/>
+      <w:r>
+        <w:rPr>
+          <w:rFonts w:ascii="Times New Roman" w:hAnsi="Times New Roman" w:cs="Times New Roman"/>
+        </w:rPr>
+        <w:t>for</w:t>
+      </w:r>
+      <w:proofErr w:type="gramEnd"/>
+      <w:r>
+        <w:rPr>
+          <w:rFonts w:ascii="Times New Roman" w:hAnsi="Times New Roman" w:cs="Times New Roman"/>
+        </w:rPr>
+        <w:t xml:space="preserve"> how long it takes for orders to be prepared and served. This data </w:t>
+      </w:r>
+      <w:r>
+        <w:rPr>
+          <w:rFonts w:ascii="Times New Roman" w:hAnsi="Times New Roman" w:cs="Times New Roman"/>
+        </w:rPr>
+        <w:t>will be stored with</w:t>
+      </w:r>
+      <w:r>
+        <w:rPr>
+          <w:rFonts w:ascii="Times New Roman" w:hAnsi="Times New Roman" w:cs="Times New Roman"/>
+        </w:rPr>
+        <w:t>in</w:t>
+      </w:r>
+      <w:r>
+        <w:rPr>
+          <w:rFonts w:ascii="Times New Roman" w:hAnsi="Times New Roman" w:cs="Times New Roman"/>
+        </w:rPr>
+        <w:t xml:space="preserve"> a MySQL database and organized to allow for easy identification of specific and average turnaround times during certain periods. This data is accessible only to the manager.</w:t>
       </w:r>
     </w:p>
     <w:p>
@@ -501,13 +609,38 @@
         <w:rPr>
           <w:rFonts w:ascii="Times New Roman" w:hAnsi="Times New Roman" w:cs="Times New Roman"/>
         </w:rPr>
-        <w:t>R.D.</w:t>
-      </w:r>
-      <w:r>
-        <w:rPr>
-          <w:rFonts w:ascii="Times New Roman" w:hAnsi="Times New Roman" w:cs="Times New Roman"/>
-        </w:rPr>
-        <w:t xml:space="preserve">3 – </w:t>
+        <w:t xml:space="preserve">R.D.3 – </w:t>
+      </w:r>
+      <w:r>
+        <w:rPr>
+          <w:rFonts w:ascii="Times New Roman" w:hAnsi="Times New Roman" w:cs="Times New Roman"/>
+        </w:rPr>
+        <w:t>The system shall collect data for menu item purchases and calculate and store the top 3 most popular items.</w:t>
+      </w:r>
+    </w:p>
+    <w:p>
+      <w:pPr>
+        <w:pStyle w:val="ListParagraph"/>
+        <w:numPr>
+          <w:ilvl w:val="1"/>
+          <w:numId w:val="1"/>
+        </w:numPr>
+        <w:spacing w:line="360" w:lineRule="auto"/>
+        <w:rPr>
+          <w:rFonts w:ascii="Times New Roman" w:hAnsi="Times New Roman" w:cs="Times New Roman"/>
+        </w:rPr>
+      </w:pPr>
+      <w:r>
+        <w:rPr>
+          <w:rFonts w:ascii="Times New Roman" w:hAnsi="Times New Roman" w:cs="Times New Roman"/>
+        </w:rPr>
+        <w:t xml:space="preserve">During operational hours, the system will record what menu items are purchased. This data will be stored within a MySQL database and categorized to easily determine item popularity during certain periods. </w:t>
+      </w:r>
+      <w:r>
+        <w:rPr>
+          <w:rFonts w:ascii="Times New Roman" w:hAnsi="Times New Roman" w:cs="Times New Roman"/>
+        </w:rPr>
+        <w:t>This data is accessible only to the manager.</w:t>
       </w:r>
     </w:p>
     <w:p>
@@ -528,6 +661,31 @@
         </w:rPr>
         <w:t xml:space="preserve">SS.1 – </w:t>
       </w:r>
+      <w:r>
+        <w:rPr>
+          <w:rFonts w:ascii="Times New Roman" w:hAnsi="Times New Roman" w:cs="Times New Roman"/>
+        </w:rPr>
+        <w:t>Staff shall clock in and clock out via the system.</w:t>
+      </w:r>
+    </w:p>
+    <w:p>
+      <w:pPr>
+        <w:pStyle w:val="ListParagraph"/>
+        <w:numPr>
+          <w:ilvl w:val="1"/>
+          <w:numId w:val="1"/>
+        </w:numPr>
+        <w:spacing w:line="360" w:lineRule="auto"/>
+        <w:rPr>
+          <w:rFonts w:ascii="Times New Roman" w:hAnsi="Times New Roman" w:cs="Times New Roman"/>
+        </w:rPr>
+      </w:pPr>
+      <w:r>
+        <w:rPr>
+          <w:rFonts w:ascii="Times New Roman" w:hAnsi="Times New Roman" w:cs="Times New Roman"/>
+        </w:rPr>
+        <w:t>Within the system is a clock-in/out page where users click a but to clock in and, at the end of their shift, click the button again to clock out. While the user is clocked in, there is a button that the user will use when taking their lunch break and returning from break. The module here tracks the user’s clock-in and clock-out times, the current date, time spent on break, and the user’s total paid time (time clocked in and not on break).</w:t>
+      </w:r>
     </w:p>
     <w:p>
       <w:pPr>
@@ -545,7 +703,122 @@
         <w:rPr>
           <w:rFonts w:ascii="Times New Roman" w:hAnsi="Times New Roman" w:cs="Times New Roman"/>
         </w:rPr>
+        <w:lastRenderedPageBreak/>
         <w:t xml:space="preserve">SS.Sa.1 – </w:t>
+      </w:r>
+      <w:r>
+        <w:rPr>
+          <w:rFonts w:ascii="Times New Roman" w:hAnsi="Times New Roman" w:cs="Times New Roman"/>
+        </w:rPr>
+        <w:t>Each staff member shall have a 6</w:t>
+      </w:r>
+      <w:r>
+        <w:rPr>
+          <w:rFonts w:ascii="Times New Roman" w:hAnsi="Times New Roman" w:cs="Times New Roman"/>
+        </w:rPr>
+        <w:t>-</w:t>
+      </w:r>
+      <w:r>
+        <w:rPr>
+          <w:rFonts w:ascii="Times New Roman" w:hAnsi="Times New Roman" w:cs="Times New Roman"/>
+        </w:rPr>
+        <w:t>character</w:t>
+      </w:r>
+      <w:r>
+        <w:rPr>
+          <w:rFonts w:ascii="Times New Roman" w:hAnsi="Times New Roman" w:cs="Times New Roman"/>
+        </w:rPr>
+        <w:t>,</w:t>
+      </w:r>
+      <w:r>
+        <w:rPr>
+          <w:rFonts w:ascii="Times New Roman" w:hAnsi="Times New Roman" w:cs="Times New Roman"/>
+        </w:rPr>
+        <w:t xml:space="preserve"> alphanumeric username.</w:t>
+      </w:r>
+    </w:p>
+    <w:p>
+      <w:pPr>
+        <w:pStyle w:val="ListParagraph"/>
+        <w:numPr>
+          <w:ilvl w:val="1"/>
+          <w:numId w:val="1"/>
+        </w:numPr>
+        <w:spacing w:line="360" w:lineRule="auto"/>
+        <w:rPr>
+          <w:rFonts w:ascii="Times New Roman" w:hAnsi="Times New Roman" w:cs="Times New Roman"/>
+        </w:rPr>
+      </w:pPr>
+      <w:r>
+        <w:rPr>
+          <w:rFonts w:ascii="Times New Roman" w:hAnsi="Times New Roman" w:cs="Times New Roman"/>
+        </w:rPr>
+        <w:t xml:space="preserve">The development team will assign a username to each current staff member according to the </w:t>
+      </w:r>
+      <w:proofErr w:type="gramStart"/>
+      <w:r>
+        <w:rPr>
+          <w:rFonts w:ascii="Times New Roman" w:hAnsi="Times New Roman" w:cs="Times New Roman"/>
+        </w:rPr>
+        <w:t>provided criteria</w:t>
+      </w:r>
+      <w:proofErr w:type="gramEnd"/>
+      <w:r>
+        <w:rPr>
+          <w:rFonts w:ascii="Times New Roman" w:hAnsi="Times New Roman" w:cs="Times New Roman"/>
+        </w:rPr>
+        <w:t>. Post deployment, staff usernames will be assigned by the client company.</w:t>
+      </w:r>
+    </w:p>
+    <w:p>
+      <w:pPr>
+        <w:pStyle w:val="ListParagraph"/>
+        <w:numPr>
+          <w:ilvl w:val="1"/>
+          <w:numId w:val="1"/>
+        </w:numPr>
+        <w:spacing w:line="360" w:lineRule="auto"/>
+        <w:rPr>
+          <w:rFonts w:ascii="Times New Roman" w:hAnsi="Times New Roman" w:cs="Times New Roman"/>
+        </w:rPr>
+      </w:pPr>
+      <w:r>
+        <w:rPr>
+          <w:rFonts w:ascii="Times New Roman" w:hAnsi="Times New Roman" w:cs="Times New Roman"/>
+        </w:rPr>
+        <w:t xml:space="preserve">The usernames will be stored within staff profiles and will be used to verify user identity during the </w:t>
+      </w:r>
+      <w:proofErr w:type="gramStart"/>
+      <w:r>
+        <w:rPr>
+          <w:rFonts w:ascii="Times New Roman" w:hAnsi="Times New Roman" w:cs="Times New Roman"/>
+        </w:rPr>
+        <w:t>sign up</w:t>
+      </w:r>
+      <w:proofErr w:type="gramEnd"/>
+      <w:r>
+        <w:rPr>
+          <w:rFonts w:ascii="Times New Roman" w:hAnsi="Times New Roman" w:cs="Times New Roman"/>
+        </w:rPr>
+        <w:t xml:space="preserve"> </w:t>
+      </w:r>
+      <w:r>
+        <w:rPr>
+          <w:rFonts w:ascii="Times New Roman" w:hAnsi="Times New Roman" w:cs="Times New Roman"/>
+        </w:rPr>
+        <w:t xml:space="preserve">and login </w:t>
+      </w:r>
+      <w:r>
+        <w:rPr>
+          <w:rFonts w:ascii="Times New Roman" w:hAnsi="Times New Roman" w:cs="Times New Roman"/>
+        </w:rPr>
+        <w:t>process</w:t>
+      </w:r>
+      <w:r>
+        <w:rPr>
+          <w:rFonts w:ascii="Times New Roman" w:hAnsi="Times New Roman" w:cs="Times New Roman"/>
+        </w:rPr>
+        <w:t>es.</w:t>
       </w:r>
     </w:p>
     <w:p>
@@ -564,19 +837,78 @@
         <w:rPr>
           <w:rFonts w:ascii="Times New Roman" w:hAnsi="Times New Roman" w:cs="Times New Roman"/>
         </w:rPr>
-        <w:t>SS.Sa.</w:t>
-      </w:r>
-      <w:r>
-        <w:rPr>
-          <w:rFonts w:ascii="Times New Roman" w:hAnsi="Times New Roman" w:cs="Times New Roman"/>
-        </w:rPr>
-        <w:t>2</w:t>
-      </w:r>
-      <w:r>
-        <w:rPr>
-          <w:rFonts w:ascii="Times New Roman" w:hAnsi="Times New Roman" w:cs="Times New Roman"/>
-        </w:rPr>
-        <w:t xml:space="preserve"> – </w:t>
+        <w:t xml:space="preserve">SS.Sa.2 – </w:t>
+      </w:r>
+      <w:r>
+        <w:rPr>
+          <w:rFonts w:ascii="Times New Roman" w:hAnsi="Times New Roman" w:cs="Times New Roman"/>
+        </w:rPr>
+        <w:t>Each staff member</w:t>
+      </w:r>
+      <w:r>
+        <w:rPr>
+          <w:rFonts w:ascii="Times New Roman" w:hAnsi="Times New Roman" w:cs="Times New Roman"/>
+        </w:rPr>
+        <w:t xml:space="preserve"> shall first sign up to the </w:t>
+      </w:r>
+      <w:r>
+        <w:rPr>
+          <w:rFonts w:ascii="Times New Roman" w:hAnsi="Times New Roman" w:cs="Times New Roman"/>
+        </w:rPr>
+        <w:t>system</w:t>
+      </w:r>
+      <w:r>
+        <w:rPr>
+          <w:rFonts w:ascii="Times New Roman" w:hAnsi="Times New Roman" w:cs="Times New Roman"/>
+        </w:rPr>
+        <w:t xml:space="preserve"> (using assigned username and creating a password).</w:t>
+      </w:r>
+    </w:p>
+    <w:p>
+      <w:pPr>
+        <w:pStyle w:val="ListParagraph"/>
+        <w:numPr>
+          <w:ilvl w:val="1"/>
+          <w:numId w:val="1"/>
+        </w:numPr>
+        <w:spacing w:line="360" w:lineRule="auto"/>
+        <w:rPr>
+          <w:rFonts w:ascii="Times New Roman" w:hAnsi="Times New Roman" w:cs="Times New Roman"/>
+        </w:rPr>
+      </w:pPr>
+      <w:r>
+        <w:rPr>
+          <w:rFonts w:ascii="Times New Roman" w:hAnsi="Times New Roman" w:cs="Times New Roman"/>
+        </w:rPr>
+        <w:t xml:space="preserve">Each staff member is </w:t>
+      </w:r>
+      <w:proofErr w:type="gramStart"/>
+      <w:r>
+        <w:rPr>
+          <w:rFonts w:ascii="Times New Roman" w:hAnsi="Times New Roman" w:cs="Times New Roman"/>
+        </w:rPr>
+        <w:t>provided</w:t>
+      </w:r>
+      <w:proofErr w:type="gramEnd"/>
+      <w:r>
+        <w:rPr>
+          <w:rFonts w:ascii="Times New Roman" w:hAnsi="Times New Roman" w:cs="Times New Roman"/>
+        </w:rPr>
+        <w:t xml:space="preserve"> their assigned username and can then proceed to sign up on the system. During the </w:t>
+      </w:r>
+      <w:proofErr w:type="gramStart"/>
+      <w:r>
+        <w:rPr>
+          <w:rFonts w:ascii="Times New Roman" w:hAnsi="Times New Roman" w:cs="Times New Roman"/>
+        </w:rPr>
+        <w:t>sign up</w:t>
+      </w:r>
+      <w:proofErr w:type="gramEnd"/>
+      <w:r>
+        <w:rPr>
+          <w:rFonts w:ascii="Times New Roman" w:hAnsi="Times New Roman" w:cs="Times New Roman"/>
+        </w:rPr>
+        <w:t xml:space="preserve"> process, the system uses the user’s username and other provided information (name and position) to identify the user and ensure they are a hired staff member. The user is then able to create a secure password that they can use to continue to access the system.</w:t>
       </w:r>
     </w:p>
     <w:p>
@@ -595,19 +927,82 @@
         <w:rPr>
           <w:rFonts w:ascii="Times New Roman" w:hAnsi="Times New Roman" w:cs="Times New Roman"/>
         </w:rPr>
-        <w:t>SS.Sa.</w:t>
-      </w:r>
-      <w:r>
-        <w:rPr>
-          <w:rFonts w:ascii="Times New Roman" w:hAnsi="Times New Roman" w:cs="Times New Roman"/>
-        </w:rPr>
-        <w:t>3</w:t>
-      </w:r>
-      <w:r>
-        <w:rPr>
-          <w:rFonts w:ascii="Times New Roman" w:hAnsi="Times New Roman" w:cs="Times New Roman"/>
-        </w:rPr>
-        <w:t xml:space="preserve"> – </w:t>
+        <w:t xml:space="preserve">SS.Sa.3 – </w:t>
+      </w:r>
+      <w:r>
+        <w:rPr>
+          <w:rFonts w:ascii="Times New Roman" w:hAnsi="Times New Roman" w:cs="Times New Roman"/>
+        </w:rPr>
+        <w:t>Staff shall log in via a login screen.</w:t>
+      </w:r>
+    </w:p>
+    <w:p>
+      <w:pPr>
+        <w:pStyle w:val="ListParagraph"/>
+        <w:numPr>
+          <w:ilvl w:val="1"/>
+          <w:numId w:val="1"/>
+        </w:numPr>
+        <w:spacing w:line="360" w:lineRule="auto"/>
+        <w:rPr>
+          <w:rFonts w:ascii="Times New Roman" w:hAnsi="Times New Roman" w:cs="Times New Roman"/>
+        </w:rPr>
+      </w:pPr>
+      <w:r>
+        <w:rPr>
+          <w:rFonts w:ascii="Times New Roman" w:hAnsi="Times New Roman" w:cs="Times New Roman"/>
+        </w:rPr>
+        <w:t xml:space="preserve">The development team will create a login module to accept user </w:t>
+      </w:r>
+      <w:proofErr w:type="gramStart"/>
+      <w:r>
+        <w:rPr>
+          <w:rFonts w:ascii="Times New Roman" w:hAnsi="Times New Roman" w:cs="Times New Roman"/>
+        </w:rPr>
+        <w:t>in[</w:t>
+      </w:r>
+      <w:proofErr w:type="spellStart"/>
+      <w:proofErr w:type="gramEnd"/>
+      <w:r>
+        <w:rPr>
+          <w:rFonts w:ascii="Times New Roman" w:hAnsi="Times New Roman" w:cs="Times New Roman"/>
+        </w:rPr>
+        <w:t>ut</w:t>
+      </w:r>
+      <w:proofErr w:type="spellEnd"/>
+      <w:r>
+        <w:rPr>
+          <w:rFonts w:ascii="Times New Roman" w:hAnsi="Times New Roman" w:cs="Times New Roman"/>
+        </w:rPr>
+        <w:t xml:space="preserve"> for the user’s username and password. Both inputs will then be verified by the system using previously confirmed information to identify the user. If the user is unidentifiable, they are denied access to the system. If the user is identifiable, they are </w:t>
+      </w:r>
+      <w:proofErr w:type="gramStart"/>
+      <w:r>
+        <w:rPr>
+          <w:rFonts w:ascii="Times New Roman" w:hAnsi="Times New Roman" w:cs="Times New Roman"/>
+        </w:rPr>
+        <w:t>provided</w:t>
+      </w:r>
+      <w:proofErr w:type="gramEnd"/>
+      <w:r>
+        <w:rPr>
+          <w:rFonts w:ascii="Times New Roman" w:hAnsi="Times New Roman" w:cs="Times New Roman"/>
+        </w:rPr>
+        <w:t xml:space="preserve"> pre-determined </w:t>
+      </w:r>
+      <w:proofErr w:type="gramStart"/>
+      <w:r>
+        <w:rPr>
+          <w:rFonts w:ascii="Times New Roman" w:hAnsi="Times New Roman" w:cs="Times New Roman"/>
+        </w:rPr>
+        <w:t>accesses</w:t>
+      </w:r>
+      <w:proofErr w:type="gramEnd"/>
+      <w:r>
+        <w:rPr>
+          <w:rFonts w:ascii="Times New Roman" w:hAnsi="Times New Roman" w:cs="Times New Roman"/>
+        </w:rPr>
+        <w:t xml:space="preserve"> within the system to be able to efficiently complete their assigned duties.</w:t>
       </w:r>
     </w:p>
     <w:p>
@@ -628,6 +1023,63 @@
         </w:rPr>
         <w:t>SSS.D.1 –</w:t>
       </w:r>
+      <w:r>
+        <w:rPr>
+          <w:rFonts w:ascii="Times New Roman" w:hAnsi="Times New Roman" w:cs="Times New Roman"/>
+        </w:rPr>
+        <w:t xml:space="preserve"> </w:t>
+      </w:r>
+      <w:r>
+        <w:rPr>
+          <w:rFonts w:ascii="Times New Roman" w:hAnsi="Times New Roman" w:cs="Times New Roman"/>
+        </w:rPr>
+        <w:t>The system shall collect data of staff shift durations and calculate each staff member's earned wage</w:t>
+      </w:r>
+      <w:r>
+        <w:rPr>
+          <w:rFonts w:ascii="Times New Roman" w:hAnsi="Times New Roman" w:cs="Times New Roman"/>
+        </w:rPr>
+        <w:t>.</w:t>
+      </w:r>
+    </w:p>
+    <w:p>
+      <w:pPr>
+        <w:pStyle w:val="ListParagraph"/>
+        <w:numPr>
+          <w:ilvl w:val="1"/>
+          <w:numId w:val="1"/>
+        </w:numPr>
+        <w:spacing w:line="360" w:lineRule="auto"/>
+        <w:rPr>
+          <w:rFonts w:ascii="Times New Roman" w:hAnsi="Times New Roman" w:cs="Times New Roman"/>
+        </w:rPr>
+      </w:pPr>
+      <w:r>
+        <w:rPr>
+          <w:rFonts w:ascii="Times New Roman" w:hAnsi="Times New Roman" w:cs="Times New Roman"/>
+        </w:rPr>
+        <w:t xml:space="preserve">The </w:t>
+      </w:r>
+      <w:proofErr w:type="gramStart"/>
+      <w:r>
+        <w:rPr>
+          <w:rFonts w:ascii="Times New Roman" w:hAnsi="Times New Roman" w:cs="Times New Roman"/>
+        </w:rPr>
+        <w:t>system shall</w:t>
+      </w:r>
+      <w:proofErr w:type="gramEnd"/>
+      <w:r>
+        <w:rPr>
+          <w:rFonts w:ascii="Times New Roman" w:hAnsi="Times New Roman" w:cs="Times New Roman"/>
+        </w:rPr>
+        <w:t xml:space="preserve"> collect data regarding each staff member’s shift for each scheduled workday (including clock-in/out times, total shift time excluding breaks, break times, and duration of breaks)</w:t>
+      </w:r>
+      <w:r>
+        <w:rPr>
+          <w:rFonts w:ascii="Times New Roman" w:hAnsi="Times New Roman" w:cs="Times New Roman"/>
+        </w:rPr>
+        <w:t xml:space="preserve"> and then store this data within a MySQL database. This data will only be accessible by the manager.</w:t>
+      </w:r>
     </w:p>
     <w:p>
       <w:pPr>
@@ -645,7 +1097,53 @@
         <w:rPr>
           <w:rFonts w:ascii="Times New Roman" w:hAnsi="Times New Roman" w:cs="Times New Roman"/>
         </w:rPr>
+        <w:lastRenderedPageBreak/>
         <w:t xml:space="preserve">SS.D.2 – </w:t>
+      </w:r>
+      <w:r>
+        <w:rPr>
+          <w:rFonts w:ascii="Times New Roman" w:hAnsi="Times New Roman" w:cs="Times New Roman"/>
+        </w:rPr>
+        <w:t>The system shall collect and store data of the duration of staff’s breaks</w:t>
+      </w:r>
+      <w:r>
+        <w:rPr>
+          <w:rFonts w:ascii="Times New Roman" w:hAnsi="Times New Roman" w:cs="Times New Roman"/>
+        </w:rPr>
+        <w:t>.</w:t>
+      </w:r>
+    </w:p>
+    <w:p>
+      <w:pPr>
+        <w:pStyle w:val="ListParagraph"/>
+        <w:numPr>
+          <w:ilvl w:val="1"/>
+          <w:numId w:val="1"/>
+        </w:numPr>
+        <w:spacing w:line="360" w:lineRule="auto"/>
+        <w:rPr>
+          <w:rFonts w:ascii="Times New Roman" w:hAnsi="Times New Roman" w:cs="Times New Roman"/>
+        </w:rPr>
+      </w:pPr>
+      <w:r>
+        <w:rPr>
+          <w:rFonts w:ascii="Times New Roman" w:hAnsi="Times New Roman" w:cs="Times New Roman"/>
+        </w:rPr>
+        <w:t xml:space="preserve">The </w:t>
+      </w:r>
+      <w:proofErr w:type="gramStart"/>
+      <w:r>
+        <w:rPr>
+          <w:rFonts w:ascii="Times New Roman" w:hAnsi="Times New Roman" w:cs="Times New Roman"/>
+        </w:rPr>
+        <w:t>system shall</w:t>
+      </w:r>
+      <w:proofErr w:type="gramEnd"/>
+      <w:r>
+        <w:rPr>
+          <w:rFonts w:ascii="Times New Roman" w:hAnsi="Times New Roman" w:cs="Times New Roman"/>
+        </w:rPr>
+        <w:t xml:space="preserve"> collect data regarding each staff member’s shift for each scheduled workday (including clock-in/out times, total shift time excluding breaks, break times, and duration of breaks) and then store this data within a MySQL database. This data will only be accessible by the manager.</w:t>
       </w:r>
     </w:p>
     <w:p>
@@ -666,6 +1164,37 @@
         </w:rPr>
         <w:t xml:space="preserve">OP.D.1 – </w:t>
       </w:r>
+      <w:r>
+        <w:rPr>
+          <w:rFonts w:ascii="Times New Roman" w:hAnsi="Times New Roman" w:cs="Times New Roman"/>
+        </w:rPr>
+        <w:t>The system shall collect and store data for revenue.</w:t>
+      </w:r>
+    </w:p>
+    <w:p>
+      <w:pPr>
+        <w:pStyle w:val="ListParagraph"/>
+        <w:numPr>
+          <w:ilvl w:val="1"/>
+          <w:numId w:val="1"/>
+        </w:numPr>
+        <w:spacing w:line="360" w:lineRule="auto"/>
+        <w:rPr>
+          <w:rFonts w:ascii="Times New Roman" w:hAnsi="Times New Roman" w:cs="Times New Roman"/>
+        </w:rPr>
+      </w:pPr>
+      <w:r>
+        <w:rPr>
+          <w:rFonts w:ascii="Times New Roman" w:hAnsi="Times New Roman" w:cs="Times New Roman"/>
+        </w:rPr>
+        <w:t xml:space="preserve">During operational hours, the system will track revenue from each order and will record from which items each amount of revenue obtained. This data will be stored in a MySQL and categorized to allow for easy identification of how much revenue was earned during set periods and what percent of the revenue was obtained from specific menu items. </w:t>
+      </w:r>
+      <w:r>
+        <w:rPr>
+          <w:rFonts w:ascii="Times New Roman" w:hAnsi="Times New Roman" w:cs="Times New Roman"/>
+        </w:rPr>
+        <w:t>This data can only be accessed by the manager.</w:t>
+      </w:r>
     </w:p>
     <w:p>
       <w:pPr>
@@ -685,6 +1214,37 @@
         </w:rPr>
         <w:t xml:space="preserve">OP.D.2 – </w:t>
       </w:r>
+      <w:r>
+        <w:rPr>
+          <w:rFonts w:ascii="Times New Roman" w:hAnsi="Times New Roman" w:cs="Times New Roman"/>
+        </w:rPr>
+        <w:t>The system shall calculate and store data for revenue contribution percentage for each menu item.</w:t>
+      </w:r>
+    </w:p>
+    <w:p>
+      <w:pPr>
+        <w:pStyle w:val="ListParagraph"/>
+        <w:numPr>
+          <w:ilvl w:val="1"/>
+          <w:numId w:val="1"/>
+        </w:numPr>
+        <w:spacing w:line="360" w:lineRule="auto"/>
+        <w:rPr>
+          <w:rFonts w:ascii="Times New Roman" w:hAnsi="Times New Roman" w:cs="Times New Roman"/>
+        </w:rPr>
+      </w:pPr>
+      <w:r>
+        <w:rPr>
+          <w:rFonts w:ascii="Times New Roman" w:hAnsi="Times New Roman" w:cs="Times New Roman"/>
+        </w:rPr>
+        <w:t>During operational hours, the system will track revenue from each order and will record from which items each amount of revenue obtained. This data will be stored in a MySQL and categorized to allow for easy identification of how much revenue was earned during set periods and what percent of the revenue was obtained from specific menu items.</w:t>
+      </w:r>
+      <w:r>
+        <w:rPr>
+          <w:rFonts w:ascii="Times New Roman" w:hAnsi="Times New Roman" w:cs="Times New Roman"/>
+        </w:rPr>
+        <w:t xml:space="preserve"> This data can only be accessed by the manager.</w:t>
+      </w:r>
     </w:p>
     <w:p>
       <w:pPr>
@@ -856,6 +1416,7 @@
         <w:rPr>
           <w:rFonts w:ascii="Times New Roman" w:hAnsi="Times New Roman" w:cs="Times New Roman"/>
         </w:rPr>
+        <w:lastRenderedPageBreak/>
         <w:t xml:space="preserve">T.2 – </w:t>
       </w:r>
     </w:p>
@@ -956,7 +1517,6 @@
         <w:pStyle w:val="heading"/>
       </w:pPr>
       <w:r>
-        <w:lastRenderedPageBreak/>
         <w:t>Nonfunctional Requirements</w:t>
       </w:r>
     </w:p>
@@ -1196,21 +1756,21 @@
         <w:pStyle w:val="heading"/>
       </w:pPr>
       <w:r>
+        <w:t>Use Case Diagrams</w:t>
+      </w:r>
+    </w:p>
+    <w:p>
+      <w:pPr>
+        <w:spacing w:line="360" w:lineRule="auto"/>
+        <w:rPr>
+          <w:rFonts w:ascii="Times New Roman" w:hAnsi="Times New Roman" w:cs="Times New Roman"/>
+        </w:rPr>
+      </w:pPr>
+      <w:r>
+        <w:rPr>
+          <w:noProof/>
+        </w:rPr>
         <w:lastRenderedPageBreak/>
-        <w:t>Use Case Diagrams</w:t>
-      </w:r>
-    </w:p>
-    <w:p>
-      <w:pPr>
-        <w:spacing w:line="360" w:lineRule="auto"/>
-        <w:rPr>
-          <w:rFonts w:ascii="Times New Roman" w:hAnsi="Times New Roman" w:cs="Times New Roman"/>
-        </w:rPr>
-      </w:pPr>
-      <w:r>
-        <w:rPr>
-          <w:noProof/>
-        </w:rPr>
         <w:drawing>
           <wp:inline distT="0" distB="0" distL="0" distR="0" wp14:anchorId="453671E7" wp14:editId="54BC7E03">
             <wp:extent cx="5943600" cy="3343275"/>
@@ -1314,7 +1874,6 @@
           <w:b/>
           <w:bCs/>
         </w:rPr>
-        <w:lastRenderedPageBreak/>
         <w:t>Use Case Flow of Events</w:t>
       </w:r>
     </w:p>
@@ -2919,7 +3478,6 @@
   <w:style w:type="character" w:default="1" w:styleId="DefaultParagraphFont">
     <w:name w:val="Default Paragraph Font"/>
     <w:uiPriority w:val="1"/>
-    <w:semiHidden/>
     <w:unhideWhenUsed/>
   </w:style>
   <w:style w:type="table" w:default="1" w:styleId="TableNormal">

</xml_diff>